<commit_message>
Deletion of spare bullet point
</commit_message>
<xml_diff>
--- a/explanation_and_notes.docx
+++ b/explanation_and_notes.docx
@@ -1,6 +1,6 @@
 
 <file path=word/document.xml><?xml version="1.0" encoding="utf-8"?>
-<w:document xmlns:wpc="http://schemas.microsoft.com/office/word/2010/wordprocessingCanvas" xmlns:cx="http://schemas.microsoft.com/office/drawing/2014/chartex" xmlns:cx1="http://schemas.microsoft.com/office/drawing/2015/9/8/chartex" xmlns:cx2="http://schemas.microsoft.com/office/drawing/2015/10/21/chartex" xmlns:cx3="http://schemas.microsoft.com/office/drawing/2016/5/9/chartex" xmlns:cx4="http://schemas.microsoft.com/office/drawing/2016/5/10/chartex" xmlns:cx5="http://schemas.microsoft.com/office/drawing/2016/5/11/chartex" xmlns:cx6="http://schemas.microsoft.com/office/drawing/2016/5/12/chartex" xmlns:cx7="http://schemas.microsoft.com/office/drawing/2016/5/13/chartex" xmlns:cx8="http://schemas.microsoft.com/office/drawing/2016/5/14/chartex" xmlns:mc="http://schemas.openxmlformats.org/markup-compatibility/2006" xmlns:aink="http://schemas.microsoft.com/office/drawing/2016/ink" xmlns:am3d="http://schemas.microsoft.com/office/drawing/2017/model3d" xmlns:o="urn:schemas-microsoft-com:office:office" xmlns:oel="http://schemas.microsoft.com/office/2019/extlst" xmlns:r="http://schemas.openxmlformats.org/officeDocument/2006/relationships" xmlns:m="http://schemas.openxmlformats.org/officeDocument/2006/math" xmlns:v="urn:schemas-microsoft-com:vml" xmlns:wp14="http://schemas.microsoft.com/office/word/2010/wordprocessingDrawing" xmlns:wp="http://schemas.openxmlformats.org/drawingml/2006/wordprocessingDrawing" xmlns:w10="urn:schemas-microsoft-com:office:word" xmlns:w="http://schemas.openxmlformats.org/wordprocessingml/2006/main" xmlns:w14="http://schemas.microsoft.com/office/word/2010/wordml" xmlns:w15="http://schemas.microsoft.com/office/word/2012/wordml" xmlns:w16cex="http://schemas.microsoft.com/office/word/2018/wordml/cex" xmlns:w16cid="http://schemas.microsoft.com/office/word/2016/wordml/cid" xmlns:w16="http://schemas.microsoft.com/office/word/2018/wordml" xmlns:w16du="http://schemas.microsoft.com/office/word/2023/wordml/word16du" xmlns:w16sdtdh="http://schemas.microsoft.com/office/word/2020/wordml/sdtdatahash" xmlns:w16sdtfl="http://schemas.microsoft.com/office/word/2024/wordml/sdtformatlock" xmlns:w16se="http://schemas.microsoft.com/office/word/2015/wordml/symex" xmlns:wpg="http://schemas.microsoft.com/office/word/2010/wordprocessingGroup" xmlns:wpi="http://schemas.microsoft.com/office/word/2010/wordprocessingInk" xmlns:wne="http://schemas.microsoft.com/office/word/2006/wordml" xmlns:wps="http://schemas.microsoft.com/office/word/2010/wordprocessingShape" mc:Ignorable="w14 w15 w16se w16cid w16 w16cex w16sdtdh w16sdtfl w16du wp14">
+<w:document xmlns:wpc="http://schemas.microsoft.com/office/word/2010/wordprocessingCanvas" xmlns:cx="http://schemas.microsoft.com/office/drawing/2014/chartex" xmlns:cx1="http://schemas.microsoft.com/office/drawing/2015/9/8/chartex" xmlns:cx2="http://schemas.microsoft.com/office/drawing/2015/10/21/chartex" xmlns:cx3="http://schemas.microsoft.com/office/drawing/2016/5/9/chartex" xmlns:cx4="http://schemas.microsoft.com/office/drawing/2016/5/10/chartex" xmlns:cx5="http://schemas.microsoft.com/office/drawing/2016/5/11/chartex" xmlns:cx6="http://schemas.microsoft.com/office/drawing/2016/5/12/chartex" xmlns:cx7="http://schemas.microsoft.com/office/drawing/2016/5/13/chartex" xmlns:cx8="http://schemas.microsoft.com/office/drawing/2016/5/14/chartex" xmlns:mc="http://schemas.openxmlformats.org/markup-compatibility/2006" xmlns:m="http://schemas.openxmlformats.org/officeDocument/2006/math" xmlns:aink="http://schemas.microsoft.com/office/drawing/2016/ink" xmlns:am3d="http://schemas.microsoft.com/office/drawing/2017/model3d" xmlns:oel="http://schemas.microsoft.com/office/2019/extlst" xmlns:r="http://schemas.openxmlformats.org/officeDocument/2006/relationships" xmlns:wp14="http://schemas.microsoft.com/office/word/2010/wordprocessingDrawing" xmlns:wp="http://schemas.openxmlformats.org/drawingml/2006/wordprocessingDrawing" xmlns:wpg="http://schemas.microsoft.com/office/word/2010/wordprocessingGroup" xmlns:wpi="http://schemas.microsoft.com/office/word/2010/wordprocessingInk" xmlns:wps="http://schemas.microsoft.com/office/word/2010/wordprocessingShape" xmlns:o="urn:schemas-microsoft-com:office:office" xmlns:v="urn:schemas-microsoft-com:vml" xmlns:w10="urn:schemas-microsoft-com:office:word" xmlns:w="http://schemas.openxmlformats.org/wordprocessingml/2006/main" xmlns:w14="http://schemas.microsoft.com/office/word/2010/wordml" xmlns:w15="http://schemas.microsoft.com/office/word/2012/wordml" xmlns:w16cei="http://schemas.microsoft.com/office/word/2026/wordml/cei" xmlns:w16cex="http://schemas.microsoft.com/office/word/2018/wordml/cex" xmlns:w16cid="http://schemas.microsoft.com/office/word/2016/wordml/cid" xmlns:w16="http://schemas.microsoft.com/office/word/2018/wordml" xmlns:w16sdtdh="http://schemas.microsoft.com/office/word/2020/wordml/sdtdatahash" xmlns:w16sdtfl="http://schemas.microsoft.com/office/word/2024/wordml/sdtformatlock" xmlns:w16se="http://schemas.microsoft.com/office/word/2015/wordml/symex" xmlns:w16du="http://schemas.microsoft.com/office/word/2023/wordml/word16du" xmlns:wne="http://schemas.microsoft.com/office/word/2006/wordml" mc:Ignorable="w14 w15 w16se w16cid w16 w16cex w16sdtdh w16sdtfl w16du wp14">
   <w:body>
     <w:p>
       <w:pPr>
@@ -12,6 +12,7 @@
           <w:szCs w:val="40"/>
         </w:rPr>
       </w:pPr>
+      <w:proofErr w:type="spellStart"/>
       <w:r>
         <w:rPr>
           <w:rStyle w:val="Strong"/>
@@ -19,7 +20,17 @@
           <w:sz w:val="40"/>
           <w:szCs w:val="40"/>
         </w:rPr>
-        <w:t>Vlieland Shiny App</w:t>
+        <w:t>Vlieland</w:t>
+      </w:r>
+      <w:proofErr w:type="spellEnd"/>
+      <w:r>
+        <w:rPr>
+          <w:rStyle w:val="Strong"/>
+          <w:rFonts w:ascii="Helvetica" w:eastAsiaTheme="majorEastAsia" w:hAnsi="Helvetica"/>
+          <w:sz w:val="40"/>
+          <w:szCs w:val="40"/>
+        </w:rPr>
+        <w:t xml:space="preserve"> Shiny App</w:t>
       </w:r>
     </w:p>
     <w:p>
@@ -78,6 +89,7 @@
           <w:szCs w:val="40"/>
         </w:rPr>
       </w:pPr>
+      <w:proofErr w:type="spellStart"/>
       <w:r>
         <w:rPr>
           <w:rStyle w:val="Strong"/>
@@ -85,23 +97,49 @@
           <w:sz w:val="40"/>
           <w:szCs w:val="40"/>
         </w:rPr>
-        <w:t>data_cleaning/</w:t>
-      </w:r>
-    </w:p>
-    <w:p>
-      <w:pPr>
-        <w:pStyle w:val="NormalWeb"/>
-        <w:rPr>
-          <w:rStyle w:val="Strong"/>
-          <w:rFonts w:ascii="Helvetica" w:eastAsiaTheme="majorEastAsia" w:hAnsi="Helvetica"/>
-        </w:rPr>
-      </w:pPr>
-      <w:r>
-        <w:rPr>
-          <w:rStyle w:val="Strong"/>
-          <w:rFonts w:ascii="Helvetica" w:eastAsiaTheme="majorEastAsia" w:hAnsi="Helvetica"/>
-        </w:rPr>
-        <w:t>Data Processing Script for Vlieland App</w:t>
+        <w:t>data_cleaning</w:t>
+      </w:r>
+      <w:proofErr w:type="spellEnd"/>
+      <w:r>
+        <w:rPr>
+          <w:rStyle w:val="Strong"/>
+          <w:rFonts w:ascii="Helvetica" w:eastAsiaTheme="majorEastAsia" w:hAnsi="Helvetica"/>
+          <w:sz w:val="40"/>
+          <w:szCs w:val="40"/>
+        </w:rPr>
+        <w:t>/</w:t>
+      </w:r>
+    </w:p>
+    <w:p>
+      <w:pPr>
+        <w:pStyle w:val="NormalWeb"/>
+        <w:rPr>
+          <w:rStyle w:val="Strong"/>
+          <w:rFonts w:ascii="Helvetica" w:eastAsiaTheme="majorEastAsia" w:hAnsi="Helvetica"/>
+        </w:rPr>
+      </w:pPr>
+      <w:r>
+        <w:rPr>
+          <w:rStyle w:val="Strong"/>
+          <w:rFonts w:ascii="Helvetica" w:eastAsiaTheme="majorEastAsia" w:hAnsi="Helvetica"/>
+        </w:rPr>
+        <w:t xml:space="preserve">Data Processing Script for </w:t>
+      </w:r>
+      <w:proofErr w:type="spellStart"/>
+      <w:r>
+        <w:rPr>
+          <w:rStyle w:val="Strong"/>
+          <w:rFonts w:ascii="Helvetica" w:eastAsiaTheme="majorEastAsia" w:hAnsi="Helvetica"/>
+        </w:rPr>
+        <w:t>Vlieland</w:t>
+      </w:r>
+      <w:proofErr w:type="spellEnd"/>
+      <w:r>
+        <w:rPr>
+          <w:rStyle w:val="Strong"/>
+          <w:rFonts w:ascii="Helvetica" w:eastAsiaTheme="majorEastAsia" w:hAnsi="Helvetica"/>
+        </w:rPr>
+        <w:t xml:space="preserve"> App</w:t>
       </w:r>
     </w:p>
     <w:p>
@@ -116,6 +154,7 @@
           <w:iCs/>
         </w:rPr>
       </w:pPr>
+      <w:proofErr w:type="spellStart"/>
       <w:r>
         <w:rPr>
           <w:rStyle w:val="Strong"/>
@@ -125,8 +164,33 @@
           <w:i/>
           <w:iCs/>
         </w:rPr>
-        <w:t>data_cleaning/real_data_processing.R</w:t>
-      </w:r>
+        <w:t>data_cleaning</w:t>
+      </w:r>
+      <w:proofErr w:type="spellEnd"/>
+      <w:r>
+        <w:rPr>
+          <w:rStyle w:val="Strong"/>
+          <w:rFonts w:ascii="Helvetica" w:eastAsiaTheme="majorEastAsia" w:hAnsi="Helvetica"/>
+          <w:b w:val="0"/>
+          <w:bCs w:val="0"/>
+          <w:i/>
+          <w:iCs/>
+        </w:rPr>
+        <w:t>/</w:t>
+      </w:r>
+      <w:proofErr w:type="spellStart"/>
+      <w:r>
+        <w:rPr>
+          <w:rStyle w:val="Strong"/>
+          <w:rFonts w:ascii="Helvetica" w:eastAsiaTheme="majorEastAsia" w:hAnsi="Helvetica"/>
+          <w:b w:val="0"/>
+          <w:bCs w:val="0"/>
+          <w:i/>
+          <w:iCs/>
+        </w:rPr>
+        <w:t>real_data_processing.R</w:t>
+      </w:r>
+      <w:proofErr w:type="spellEnd"/>
     </w:p>
     <w:p>
       <w:pPr>
@@ -149,7 +213,47 @@
           <w:b w:val="0"/>
           <w:bCs w:val="0"/>
         </w:rPr>
-        <w:t>Create dfs analagous to dummy datasets that I built the modules with</w:t>
+        <w:t xml:space="preserve">Create </w:t>
+      </w:r>
+      <w:proofErr w:type="spellStart"/>
+      <w:r>
+        <w:rPr>
+          <w:rStyle w:val="Strong"/>
+          <w:rFonts w:ascii="Helvetica" w:eastAsiaTheme="majorEastAsia" w:hAnsi="Helvetica"/>
+          <w:b w:val="0"/>
+          <w:bCs w:val="0"/>
+        </w:rPr>
+        <w:t>dfs</w:t>
+      </w:r>
+      <w:proofErr w:type="spellEnd"/>
+      <w:r>
+        <w:rPr>
+          <w:rStyle w:val="Strong"/>
+          <w:rFonts w:ascii="Helvetica" w:eastAsiaTheme="majorEastAsia" w:hAnsi="Helvetica"/>
+          <w:b w:val="0"/>
+          <w:bCs w:val="0"/>
+        </w:rPr>
+        <w:t xml:space="preserve"> </w:t>
+      </w:r>
+      <w:proofErr w:type="spellStart"/>
+      <w:r>
+        <w:rPr>
+          <w:rStyle w:val="Strong"/>
+          <w:rFonts w:ascii="Helvetica" w:eastAsiaTheme="majorEastAsia" w:hAnsi="Helvetica"/>
+          <w:b w:val="0"/>
+          <w:bCs w:val="0"/>
+        </w:rPr>
+        <w:t>analagous</w:t>
+      </w:r>
+      <w:proofErr w:type="spellEnd"/>
+      <w:r>
+        <w:rPr>
+          <w:rStyle w:val="Strong"/>
+          <w:rFonts w:ascii="Helvetica" w:eastAsiaTheme="majorEastAsia" w:hAnsi="Helvetica"/>
+          <w:b w:val="0"/>
+          <w:bCs w:val="0"/>
+        </w:rPr>
+        <w:t xml:space="preserve"> to dummy datasets that I built the modules with</w:t>
       </w:r>
     </w:p>
     <w:p>
@@ -221,6 +325,7 @@
           <w:szCs w:val="22"/>
         </w:rPr>
       </w:pPr>
+      <w:proofErr w:type="spellStart"/>
       <w:r>
         <w:rPr>
           <w:rStyle w:val="Strong"/>
@@ -232,6 +337,7 @@
         </w:rPr>
         <w:t>IndividualDataVlieland</w:t>
       </w:r>
+      <w:proofErr w:type="spellEnd"/>
       <w:r>
         <w:rPr>
           <w:rStyle w:val="Strong"/>
@@ -253,17 +359,79 @@
           <w:szCs w:val="22"/>
         </w:rPr>
         <w:br/>
-      </w:r>
-      <w:r>
-        <w:rPr>
-          <w:rStyle w:val="Strong"/>
-          <w:rFonts w:ascii="Helvetica" w:eastAsiaTheme="majorEastAsia" w:hAnsi="Helvetica"/>
-          <w:b w:val="0"/>
-          <w:bCs w:val="0"/>
-          <w:sz w:val="22"/>
-          <w:szCs w:val="22"/>
-        </w:rPr>
-        <w:t>[1] "RingNumber"         "Mother"             "Father"             "BroodID"            "Sex"                "RingYear"</w:t>
+        <w:t>[1] "</w:t>
+      </w:r>
+      <w:proofErr w:type="spellStart"/>
+      <w:r>
+        <w:rPr>
+          <w:rStyle w:val="Strong"/>
+          <w:rFonts w:ascii="Helvetica" w:eastAsiaTheme="majorEastAsia" w:hAnsi="Helvetica"/>
+          <w:b w:val="0"/>
+          <w:bCs w:val="0"/>
+          <w:sz w:val="22"/>
+          <w:szCs w:val="22"/>
+        </w:rPr>
+        <w:t>RingNumber</w:t>
+      </w:r>
+      <w:proofErr w:type="spellEnd"/>
+      <w:r>
+        <w:rPr>
+          <w:rStyle w:val="Strong"/>
+          <w:rFonts w:ascii="Helvetica" w:eastAsiaTheme="majorEastAsia" w:hAnsi="Helvetica"/>
+          <w:b w:val="0"/>
+          <w:bCs w:val="0"/>
+          <w:sz w:val="22"/>
+          <w:szCs w:val="22"/>
+        </w:rPr>
+        <w:t>"         "Mother"             "Father"             "</w:t>
+      </w:r>
+      <w:proofErr w:type="spellStart"/>
+      <w:r>
+        <w:rPr>
+          <w:rStyle w:val="Strong"/>
+          <w:rFonts w:ascii="Helvetica" w:eastAsiaTheme="majorEastAsia" w:hAnsi="Helvetica"/>
+          <w:b w:val="0"/>
+          <w:bCs w:val="0"/>
+          <w:sz w:val="22"/>
+          <w:szCs w:val="22"/>
+        </w:rPr>
+        <w:t>BroodID</w:t>
+      </w:r>
+      <w:proofErr w:type="spellEnd"/>
+      <w:r>
+        <w:rPr>
+          <w:rStyle w:val="Strong"/>
+          <w:rFonts w:ascii="Helvetica" w:eastAsiaTheme="majorEastAsia" w:hAnsi="Helvetica"/>
+          <w:b w:val="0"/>
+          <w:bCs w:val="0"/>
+          <w:sz w:val="22"/>
+          <w:szCs w:val="22"/>
+        </w:rPr>
+        <w:t>"            "Sex"                "</w:t>
+      </w:r>
+      <w:proofErr w:type="spellStart"/>
+      <w:r>
+        <w:rPr>
+          <w:rStyle w:val="Strong"/>
+          <w:rFonts w:ascii="Helvetica" w:eastAsiaTheme="majorEastAsia" w:hAnsi="Helvetica"/>
+          <w:b w:val="0"/>
+          <w:bCs w:val="0"/>
+          <w:sz w:val="22"/>
+          <w:szCs w:val="22"/>
+        </w:rPr>
+        <w:t>RingYear</w:t>
+      </w:r>
+      <w:proofErr w:type="spellEnd"/>
+      <w:r>
+        <w:rPr>
+          <w:rStyle w:val="Strong"/>
+          <w:rFonts w:ascii="Helvetica" w:eastAsiaTheme="majorEastAsia" w:hAnsi="Helvetica"/>
+          <w:b w:val="0"/>
+          <w:bCs w:val="0"/>
+          <w:sz w:val="22"/>
+          <w:szCs w:val="22"/>
+        </w:rPr>
+        <w:t>"</w:t>
       </w:r>
       <w:r>
         <w:rPr>
@@ -275,17 +443,127 @@
           <w:szCs w:val="22"/>
         </w:rPr>
         <w:br/>
-      </w:r>
-      <w:r>
-        <w:rPr>
-          <w:rStyle w:val="Strong"/>
-          <w:rFonts w:ascii="Helvetica" w:eastAsiaTheme="majorEastAsia" w:hAnsi="Helvetica"/>
-          <w:b w:val="0"/>
-          <w:bCs w:val="0"/>
-          <w:sz w:val="22"/>
-          <w:szCs w:val="22"/>
-        </w:rPr>
-        <w:t>[7] "BirthYear"          "RingPopulationName" "RingNestBox"        "RingLatitude"       "RingLongitude"      "Species"</w:t>
+        <w:t>[7] "</w:t>
+      </w:r>
+      <w:proofErr w:type="spellStart"/>
+      <w:r>
+        <w:rPr>
+          <w:rStyle w:val="Strong"/>
+          <w:rFonts w:ascii="Helvetica" w:eastAsiaTheme="majorEastAsia" w:hAnsi="Helvetica"/>
+          <w:b w:val="0"/>
+          <w:bCs w:val="0"/>
+          <w:sz w:val="22"/>
+          <w:szCs w:val="22"/>
+        </w:rPr>
+        <w:t>BirthYear</w:t>
+      </w:r>
+      <w:proofErr w:type="spellEnd"/>
+      <w:r>
+        <w:rPr>
+          <w:rStyle w:val="Strong"/>
+          <w:rFonts w:ascii="Helvetica" w:eastAsiaTheme="majorEastAsia" w:hAnsi="Helvetica"/>
+          <w:b w:val="0"/>
+          <w:bCs w:val="0"/>
+          <w:sz w:val="22"/>
+          <w:szCs w:val="22"/>
+        </w:rPr>
+        <w:t>"          "</w:t>
+      </w:r>
+      <w:proofErr w:type="spellStart"/>
+      <w:r>
+        <w:rPr>
+          <w:rStyle w:val="Strong"/>
+          <w:rFonts w:ascii="Helvetica" w:eastAsiaTheme="majorEastAsia" w:hAnsi="Helvetica"/>
+          <w:b w:val="0"/>
+          <w:bCs w:val="0"/>
+          <w:sz w:val="22"/>
+          <w:szCs w:val="22"/>
+        </w:rPr>
+        <w:t>RingPopulationName</w:t>
+      </w:r>
+      <w:proofErr w:type="spellEnd"/>
+      <w:r>
+        <w:rPr>
+          <w:rStyle w:val="Strong"/>
+          <w:rFonts w:ascii="Helvetica" w:eastAsiaTheme="majorEastAsia" w:hAnsi="Helvetica"/>
+          <w:b w:val="0"/>
+          <w:bCs w:val="0"/>
+          <w:sz w:val="22"/>
+          <w:szCs w:val="22"/>
+        </w:rPr>
+        <w:t>" "</w:t>
+      </w:r>
+      <w:proofErr w:type="spellStart"/>
+      <w:r>
+        <w:rPr>
+          <w:rStyle w:val="Strong"/>
+          <w:rFonts w:ascii="Helvetica" w:eastAsiaTheme="majorEastAsia" w:hAnsi="Helvetica"/>
+          <w:b w:val="0"/>
+          <w:bCs w:val="0"/>
+          <w:sz w:val="22"/>
+          <w:szCs w:val="22"/>
+        </w:rPr>
+        <w:t>RingNestBox</w:t>
+      </w:r>
+      <w:proofErr w:type="spellEnd"/>
+      <w:r>
+        <w:rPr>
+          <w:rStyle w:val="Strong"/>
+          <w:rFonts w:ascii="Helvetica" w:eastAsiaTheme="majorEastAsia" w:hAnsi="Helvetica"/>
+          <w:b w:val="0"/>
+          <w:bCs w:val="0"/>
+          <w:sz w:val="22"/>
+          <w:szCs w:val="22"/>
+        </w:rPr>
+        <w:t>"        "</w:t>
+      </w:r>
+      <w:proofErr w:type="spellStart"/>
+      <w:r>
+        <w:rPr>
+          <w:rStyle w:val="Strong"/>
+          <w:rFonts w:ascii="Helvetica" w:eastAsiaTheme="majorEastAsia" w:hAnsi="Helvetica"/>
+          <w:b w:val="0"/>
+          <w:bCs w:val="0"/>
+          <w:sz w:val="22"/>
+          <w:szCs w:val="22"/>
+        </w:rPr>
+        <w:t>RingLatitude</w:t>
+      </w:r>
+      <w:proofErr w:type="spellEnd"/>
+      <w:r>
+        <w:rPr>
+          <w:rStyle w:val="Strong"/>
+          <w:rFonts w:ascii="Helvetica" w:eastAsiaTheme="majorEastAsia" w:hAnsi="Helvetica"/>
+          <w:b w:val="0"/>
+          <w:bCs w:val="0"/>
+          <w:sz w:val="22"/>
+          <w:szCs w:val="22"/>
+        </w:rPr>
+        <w:t>"       "</w:t>
+      </w:r>
+      <w:proofErr w:type="spellStart"/>
+      <w:r>
+        <w:rPr>
+          <w:rStyle w:val="Strong"/>
+          <w:rFonts w:ascii="Helvetica" w:eastAsiaTheme="majorEastAsia" w:hAnsi="Helvetica"/>
+          <w:b w:val="0"/>
+          <w:bCs w:val="0"/>
+          <w:sz w:val="22"/>
+          <w:szCs w:val="22"/>
+        </w:rPr>
+        <w:t>RingLongitude</w:t>
+      </w:r>
+      <w:proofErr w:type="spellEnd"/>
+      <w:r>
+        <w:rPr>
+          <w:rStyle w:val="Strong"/>
+          <w:rFonts w:ascii="Helvetica" w:eastAsiaTheme="majorEastAsia" w:hAnsi="Helvetica"/>
+          <w:b w:val="0"/>
+          <w:bCs w:val="0"/>
+          <w:sz w:val="22"/>
+          <w:szCs w:val="22"/>
+        </w:rPr>
+        <w:t>"      "Species"</w:t>
       </w:r>
       <w:r>
         <w:rPr>
@@ -297,31 +575,70 @@
           <w:szCs w:val="22"/>
         </w:rPr>
         <w:br/>
-      </w:r>
-      <w:r>
-        <w:rPr>
-          <w:rStyle w:val="Strong"/>
-          <w:rFonts w:ascii="Helvetica" w:eastAsiaTheme="majorEastAsia" w:hAnsi="Helvetica"/>
-          <w:b w:val="0"/>
-          <w:bCs w:val="0"/>
-          <w:sz w:val="22"/>
-          <w:szCs w:val="22"/>
-        </w:rPr>
-        <w:t xml:space="preserve">[13] "RingColour"         "ColourRingLeft1"    "ColourRingLeft2"    "ColourRingRight1"   "ColourRingRight2"   "ColourRingCombo"   </w:t>
-      </w:r>
-    </w:p>
-    <w:p>
-      <w:pPr>
-        <w:pStyle w:val="NormalWeb"/>
-        <w:rPr>
-          <w:rStyle w:val="Strong"/>
-          <w:rFonts w:ascii="Helvetica" w:eastAsiaTheme="majorEastAsia" w:hAnsi="Helvetica"/>
-          <w:b w:val="0"/>
-          <w:bCs w:val="0"/>
-          <w:sz w:val="22"/>
-          <w:szCs w:val="22"/>
-        </w:rPr>
-      </w:pPr>
+        <w:t>[13] "</w:t>
+      </w:r>
+      <w:proofErr w:type="spellStart"/>
+      <w:r>
+        <w:rPr>
+          <w:rStyle w:val="Strong"/>
+          <w:rFonts w:ascii="Helvetica" w:eastAsiaTheme="majorEastAsia" w:hAnsi="Helvetica"/>
+          <w:b w:val="0"/>
+          <w:bCs w:val="0"/>
+          <w:sz w:val="22"/>
+          <w:szCs w:val="22"/>
+        </w:rPr>
+        <w:t>RingColour</w:t>
+      </w:r>
+      <w:proofErr w:type="spellEnd"/>
+      <w:r>
+        <w:rPr>
+          <w:rStyle w:val="Strong"/>
+          <w:rFonts w:ascii="Helvetica" w:eastAsiaTheme="majorEastAsia" w:hAnsi="Helvetica"/>
+          <w:b w:val="0"/>
+          <w:bCs w:val="0"/>
+          <w:sz w:val="22"/>
+          <w:szCs w:val="22"/>
+        </w:rPr>
+        <w:t>"         "ColourRingLeft1"    "ColourRingLeft2"    "ColourRingRight1"   "ColourRingRight2"   "</w:t>
+      </w:r>
+      <w:proofErr w:type="spellStart"/>
+      <w:r>
+        <w:rPr>
+          <w:rStyle w:val="Strong"/>
+          <w:rFonts w:ascii="Helvetica" w:eastAsiaTheme="majorEastAsia" w:hAnsi="Helvetica"/>
+          <w:b w:val="0"/>
+          <w:bCs w:val="0"/>
+          <w:sz w:val="22"/>
+          <w:szCs w:val="22"/>
+        </w:rPr>
+        <w:t>ColourRingCombo</w:t>
+      </w:r>
+      <w:proofErr w:type="spellEnd"/>
+      <w:r>
+        <w:rPr>
+          <w:rStyle w:val="Strong"/>
+          <w:rFonts w:ascii="Helvetica" w:eastAsiaTheme="majorEastAsia" w:hAnsi="Helvetica"/>
+          <w:b w:val="0"/>
+          <w:bCs w:val="0"/>
+          <w:sz w:val="22"/>
+          <w:szCs w:val="22"/>
+        </w:rPr>
+        <w:t xml:space="preserve">"   </w:t>
+      </w:r>
+    </w:p>
+    <w:p>
+      <w:pPr>
+        <w:pStyle w:val="NormalWeb"/>
+        <w:rPr>
+          <w:rStyle w:val="Strong"/>
+          <w:rFonts w:ascii="Helvetica" w:eastAsiaTheme="majorEastAsia" w:hAnsi="Helvetica"/>
+          <w:b w:val="0"/>
+          <w:bCs w:val="0"/>
+          <w:sz w:val="22"/>
+          <w:szCs w:val="22"/>
+        </w:rPr>
+      </w:pPr>
+      <w:proofErr w:type="spellStart"/>
       <w:r>
         <w:rPr>
           <w:rStyle w:val="Strong"/>
@@ -333,6 +650,7 @@
         </w:rPr>
         <w:t>BroodData</w:t>
       </w:r>
+      <w:proofErr w:type="spellEnd"/>
       <w:r>
         <w:rPr>
           <w:rStyle w:val="Strong"/>
@@ -343,17 +661,103 @@
           <w:szCs w:val="22"/>
         </w:rPr>
         <w:br/>
-      </w:r>
-      <w:r>
-        <w:rPr>
-          <w:rStyle w:val="Strong"/>
-          <w:rFonts w:ascii="Helvetica" w:eastAsiaTheme="majorEastAsia" w:hAnsi="Helvetica"/>
-          <w:b w:val="0"/>
-          <w:bCs w:val="0"/>
-          <w:sz w:val="22"/>
-          <w:szCs w:val="22"/>
-        </w:rPr>
-        <w:t xml:space="preserve"> [1] "ID"                  "BroodYear"           "RingNumberFemale"    "RingNumberMale"      "LayDate"</w:t>
+        <w:t xml:space="preserve"> [1] "ID"                  "</w:t>
+      </w:r>
+      <w:proofErr w:type="spellStart"/>
+      <w:r>
+        <w:rPr>
+          <w:rStyle w:val="Strong"/>
+          <w:rFonts w:ascii="Helvetica" w:eastAsiaTheme="majorEastAsia" w:hAnsi="Helvetica"/>
+          <w:b w:val="0"/>
+          <w:bCs w:val="0"/>
+          <w:sz w:val="22"/>
+          <w:szCs w:val="22"/>
+        </w:rPr>
+        <w:t>BroodYear</w:t>
+      </w:r>
+      <w:proofErr w:type="spellEnd"/>
+      <w:r>
+        <w:rPr>
+          <w:rStyle w:val="Strong"/>
+          <w:rFonts w:ascii="Helvetica" w:eastAsiaTheme="majorEastAsia" w:hAnsi="Helvetica"/>
+          <w:b w:val="0"/>
+          <w:bCs w:val="0"/>
+          <w:sz w:val="22"/>
+          <w:szCs w:val="22"/>
+        </w:rPr>
+        <w:t>"           "</w:t>
+      </w:r>
+      <w:proofErr w:type="spellStart"/>
+      <w:r>
+        <w:rPr>
+          <w:rStyle w:val="Strong"/>
+          <w:rFonts w:ascii="Helvetica" w:eastAsiaTheme="majorEastAsia" w:hAnsi="Helvetica"/>
+          <w:b w:val="0"/>
+          <w:bCs w:val="0"/>
+          <w:sz w:val="22"/>
+          <w:szCs w:val="22"/>
+        </w:rPr>
+        <w:t>RingNumberFemale</w:t>
+      </w:r>
+      <w:proofErr w:type="spellEnd"/>
+      <w:r>
+        <w:rPr>
+          <w:rStyle w:val="Strong"/>
+          <w:rFonts w:ascii="Helvetica" w:eastAsiaTheme="majorEastAsia" w:hAnsi="Helvetica"/>
+          <w:b w:val="0"/>
+          <w:bCs w:val="0"/>
+          <w:sz w:val="22"/>
+          <w:szCs w:val="22"/>
+        </w:rPr>
+        <w:t>"    "</w:t>
+      </w:r>
+      <w:proofErr w:type="spellStart"/>
+      <w:r>
+        <w:rPr>
+          <w:rStyle w:val="Strong"/>
+          <w:rFonts w:ascii="Helvetica" w:eastAsiaTheme="majorEastAsia" w:hAnsi="Helvetica"/>
+          <w:b w:val="0"/>
+          <w:bCs w:val="0"/>
+          <w:sz w:val="22"/>
+          <w:szCs w:val="22"/>
+        </w:rPr>
+        <w:t>RingNumberMale</w:t>
+      </w:r>
+      <w:proofErr w:type="spellEnd"/>
+      <w:r>
+        <w:rPr>
+          <w:rStyle w:val="Strong"/>
+          <w:rFonts w:ascii="Helvetica" w:eastAsiaTheme="majorEastAsia" w:hAnsi="Helvetica"/>
+          <w:b w:val="0"/>
+          <w:bCs w:val="0"/>
+          <w:sz w:val="22"/>
+          <w:szCs w:val="22"/>
+        </w:rPr>
+        <w:t>"      "</w:t>
+      </w:r>
+      <w:proofErr w:type="spellStart"/>
+      <w:r>
+        <w:rPr>
+          <w:rStyle w:val="Strong"/>
+          <w:rFonts w:ascii="Helvetica" w:eastAsiaTheme="majorEastAsia" w:hAnsi="Helvetica"/>
+          <w:b w:val="0"/>
+          <w:bCs w:val="0"/>
+          <w:sz w:val="22"/>
+          <w:szCs w:val="22"/>
+        </w:rPr>
+        <w:t>LayDate</w:t>
+      </w:r>
+      <w:proofErr w:type="spellEnd"/>
+      <w:r>
+        <w:rPr>
+          <w:rStyle w:val="Strong"/>
+          <w:rFonts w:ascii="Helvetica" w:eastAsiaTheme="majorEastAsia" w:hAnsi="Helvetica"/>
+          <w:b w:val="0"/>
+          <w:bCs w:val="0"/>
+          <w:sz w:val="22"/>
+          <w:szCs w:val="22"/>
+        </w:rPr>
+        <w:t>"</w:t>
       </w:r>
       <w:r>
         <w:rPr>
@@ -365,18 +769,117 @@
           <w:szCs w:val="22"/>
         </w:rPr>
         <w:br/>
-      </w:r>
-      <w:r>
-        <w:rPr>
-          <w:rStyle w:val="Strong"/>
-          <w:rFonts w:ascii="Helvetica" w:eastAsiaTheme="majorEastAsia" w:hAnsi="Helvetica"/>
-          <w:b w:val="0"/>
-          <w:bCs w:val="0"/>
-          <w:sz w:val="22"/>
-          <w:szCs w:val="22"/>
-        </w:rPr>
-        <w:t>[6] "ClutchSize"          "BroodNestBox"        "BroodLatitude"       "BroodLongitude"      "BroodPopulationName</w:t>
-      </w:r>
+        <w:t>[6] "</w:t>
+      </w:r>
+      <w:proofErr w:type="spellStart"/>
+      <w:r>
+        <w:rPr>
+          <w:rStyle w:val="Strong"/>
+          <w:rFonts w:ascii="Helvetica" w:eastAsiaTheme="majorEastAsia" w:hAnsi="Helvetica"/>
+          <w:b w:val="0"/>
+          <w:bCs w:val="0"/>
+          <w:sz w:val="22"/>
+          <w:szCs w:val="22"/>
+        </w:rPr>
+        <w:t>ClutchSize</w:t>
+      </w:r>
+      <w:proofErr w:type="spellEnd"/>
+      <w:r>
+        <w:rPr>
+          <w:rStyle w:val="Strong"/>
+          <w:rFonts w:ascii="Helvetica" w:eastAsiaTheme="majorEastAsia" w:hAnsi="Helvetica"/>
+          <w:b w:val="0"/>
+          <w:bCs w:val="0"/>
+          <w:sz w:val="22"/>
+          <w:szCs w:val="22"/>
+        </w:rPr>
+        <w:t>"          "</w:t>
+      </w:r>
+      <w:proofErr w:type="spellStart"/>
+      <w:r>
+        <w:rPr>
+          <w:rStyle w:val="Strong"/>
+          <w:rFonts w:ascii="Helvetica" w:eastAsiaTheme="majorEastAsia" w:hAnsi="Helvetica"/>
+          <w:b w:val="0"/>
+          <w:bCs w:val="0"/>
+          <w:sz w:val="22"/>
+          <w:szCs w:val="22"/>
+        </w:rPr>
+        <w:t>BroodNestBox</w:t>
+      </w:r>
+      <w:proofErr w:type="spellEnd"/>
+      <w:r>
+        <w:rPr>
+          <w:rStyle w:val="Strong"/>
+          <w:rFonts w:ascii="Helvetica" w:eastAsiaTheme="majorEastAsia" w:hAnsi="Helvetica"/>
+          <w:b w:val="0"/>
+          <w:bCs w:val="0"/>
+          <w:sz w:val="22"/>
+          <w:szCs w:val="22"/>
+        </w:rPr>
+        <w:t>"        "</w:t>
+      </w:r>
+      <w:proofErr w:type="spellStart"/>
+      <w:r>
+        <w:rPr>
+          <w:rStyle w:val="Strong"/>
+          <w:rFonts w:ascii="Helvetica" w:eastAsiaTheme="majorEastAsia" w:hAnsi="Helvetica"/>
+          <w:b w:val="0"/>
+          <w:bCs w:val="0"/>
+          <w:sz w:val="22"/>
+          <w:szCs w:val="22"/>
+        </w:rPr>
+        <w:t>BroodLatitude</w:t>
+      </w:r>
+      <w:proofErr w:type="spellEnd"/>
+      <w:r>
+        <w:rPr>
+          <w:rStyle w:val="Strong"/>
+          <w:rFonts w:ascii="Helvetica" w:eastAsiaTheme="majorEastAsia" w:hAnsi="Helvetica"/>
+          <w:b w:val="0"/>
+          <w:bCs w:val="0"/>
+          <w:sz w:val="22"/>
+          <w:szCs w:val="22"/>
+        </w:rPr>
+        <w:t>"       "</w:t>
+      </w:r>
+      <w:proofErr w:type="spellStart"/>
+      <w:r>
+        <w:rPr>
+          <w:rStyle w:val="Strong"/>
+          <w:rFonts w:ascii="Helvetica" w:eastAsiaTheme="majorEastAsia" w:hAnsi="Helvetica"/>
+          <w:b w:val="0"/>
+          <w:bCs w:val="0"/>
+          <w:sz w:val="22"/>
+          <w:szCs w:val="22"/>
+        </w:rPr>
+        <w:t>BroodLongitude</w:t>
+      </w:r>
+      <w:proofErr w:type="spellEnd"/>
+      <w:r>
+        <w:rPr>
+          <w:rStyle w:val="Strong"/>
+          <w:rFonts w:ascii="Helvetica" w:eastAsiaTheme="majorEastAsia" w:hAnsi="Helvetica"/>
+          <w:b w:val="0"/>
+          <w:bCs w:val="0"/>
+          <w:sz w:val="22"/>
+          <w:szCs w:val="22"/>
+        </w:rPr>
+        <w:t>"      "</w:t>
+      </w:r>
+      <w:proofErr w:type="spellStart"/>
+      <w:r>
+        <w:rPr>
+          <w:rStyle w:val="Strong"/>
+          <w:rFonts w:ascii="Helvetica" w:eastAsiaTheme="majorEastAsia" w:hAnsi="Helvetica"/>
+          <w:b w:val="0"/>
+          <w:bCs w:val="0"/>
+          <w:sz w:val="22"/>
+          <w:szCs w:val="22"/>
+        </w:rPr>
+        <w:t>BroodPopulationName</w:t>
+      </w:r>
+      <w:proofErr w:type="spellEnd"/>
       <w:r>
         <w:rPr>
           <w:rStyle w:val="Strong"/>
@@ -398,31 +901,46 @@
           <w:szCs w:val="22"/>
         </w:rPr>
         <w:br/>
-      </w:r>
-      <w:r>
-        <w:rPr>
-          <w:rStyle w:val="Strong"/>
-          <w:rFonts w:ascii="Helvetica" w:eastAsiaTheme="majorEastAsia" w:hAnsi="Helvetica"/>
-          <w:b w:val="0"/>
-          <w:bCs w:val="0"/>
-          <w:sz w:val="22"/>
-          <w:szCs w:val="22"/>
-        </w:rPr>
-        <w:t xml:space="preserve">[11] "SpeciesName"   </w:t>
-      </w:r>
-    </w:p>
-    <w:p>
-      <w:pPr>
-        <w:pStyle w:val="NormalWeb"/>
-        <w:rPr>
-          <w:rStyle w:val="Strong"/>
-          <w:rFonts w:ascii="Helvetica" w:eastAsiaTheme="majorEastAsia" w:hAnsi="Helvetica"/>
-          <w:b w:val="0"/>
-          <w:bCs w:val="0"/>
-          <w:sz w:val="22"/>
-          <w:szCs w:val="22"/>
-        </w:rPr>
-      </w:pPr>
+        <w:t>[11] "</w:t>
+      </w:r>
+      <w:proofErr w:type="spellStart"/>
+      <w:r>
+        <w:rPr>
+          <w:rStyle w:val="Strong"/>
+          <w:rFonts w:ascii="Helvetica" w:eastAsiaTheme="majorEastAsia" w:hAnsi="Helvetica"/>
+          <w:b w:val="0"/>
+          <w:bCs w:val="0"/>
+          <w:sz w:val="22"/>
+          <w:szCs w:val="22"/>
+        </w:rPr>
+        <w:t>SpeciesName</w:t>
+      </w:r>
+      <w:proofErr w:type="spellEnd"/>
+      <w:r>
+        <w:rPr>
+          <w:rStyle w:val="Strong"/>
+          <w:rFonts w:ascii="Helvetica" w:eastAsiaTheme="majorEastAsia" w:hAnsi="Helvetica"/>
+          <w:b w:val="0"/>
+          <w:bCs w:val="0"/>
+          <w:sz w:val="22"/>
+          <w:szCs w:val="22"/>
+        </w:rPr>
+        <w:t xml:space="preserve">"   </w:t>
+      </w:r>
+    </w:p>
+    <w:p>
+      <w:pPr>
+        <w:pStyle w:val="NormalWeb"/>
+        <w:rPr>
+          <w:rStyle w:val="Strong"/>
+          <w:rFonts w:ascii="Helvetica" w:eastAsiaTheme="majorEastAsia" w:hAnsi="Helvetica"/>
+          <w:b w:val="0"/>
+          <w:bCs w:val="0"/>
+          <w:sz w:val="22"/>
+          <w:szCs w:val="22"/>
+        </w:rPr>
+      </w:pPr>
+      <w:proofErr w:type="spellStart"/>
       <w:r>
         <w:rPr>
           <w:rStyle w:val="Strong"/>
@@ -434,16 +952,63 @@
         </w:rPr>
         <w:t>location.data</w:t>
       </w:r>
-      <w:r>
-        <w:rPr>
-          <w:rStyle w:val="Strong"/>
-          <w:rFonts w:ascii="Helvetica" w:eastAsiaTheme="majorEastAsia" w:hAnsi="Helvetica"/>
-          <w:b w:val="0"/>
-          <w:bCs w:val="0"/>
-          <w:sz w:val="22"/>
-          <w:szCs w:val="22"/>
-        </w:rPr>
-        <w:t xml:space="preserve"> (for mapping)</w:t>
+      <w:proofErr w:type="spellEnd"/>
+      <w:r>
+        <w:rPr>
+          <w:rStyle w:val="Strong"/>
+          <w:rFonts w:ascii="Helvetica" w:eastAsiaTheme="majorEastAsia" w:hAnsi="Helvetica"/>
+          <w:b w:val="0"/>
+          <w:bCs w:val="0"/>
+          <w:sz w:val="22"/>
+          <w:szCs w:val="22"/>
+        </w:rPr>
+        <w:t xml:space="preserve"> (for mappin</w:t>
+      </w:r>
+      <w:r>
+        <w:rPr>
+          <w:rStyle w:val="Strong"/>
+          <w:rFonts w:ascii="Helvetica" w:eastAsiaTheme="majorEastAsia" w:hAnsi="Helvetica"/>
+          <w:b w:val="0"/>
+          <w:bCs w:val="0"/>
+          <w:sz w:val="22"/>
+          <w:szCs w:val="22"/>
+        </w:rPr>
+        <w:t xml:space="preserve">g. Object in app called </w:t>
+      </w:r>
+      <w:proofErr w:type="spellStart"/>
+      <w:r>
+        <w:rPr>
+          <w:rStyle w:val="Strong"/>
+          <w:rFonts w:ascii="Helvetica" w:eastAsiaTheme="majorEastAsia" w:hAnsi="Helvetica"/>
+          <w:b w:val="0"/>
+          <w:bCs w:val="0"/>
+          <w:sz w:val="22"/>
+          <w:szCs w:val="22"/>
+        </w:rPr>
+        <w:t>location.data</w:t>
+      </w:r>
+      <w:proofErr w:type="spellEnd"/>
+      <w:r>
+        <w:rPr>
+          <w:rStyle w:val="Strong"/>
+          <w:rFonts w:ascii="Helvetica" w:eastAsiaTheme="majorEastAsia" w:hAnsi="Helvetica"/>
+          <w:b w:val="0"/>
+          <w:bCs w:val="0"/>
+          <w:sz w:val="22"/>
+          <w:szCs w:val="22"/>
+        </w:rPr>
+        <w:t>, file called location_data.csv</w:t>
+      </w:r>
+      <w:r>
+        <w:rPr>
+          <w:rStyle w:val="Strong"/>
+          <w:rFonts w:ascii="Helvetica" w:eastAsiaTheme="majorEastAsia" w:hAnsi="Helvetica"/>
+          <w:b w:val="0"/>
+          <w:bCs w:val="0"/>
+          <w:sz w:val="22"/>
+          <w:szCs w:val="22"/>
+        </w:rPr>
+        <w:t>)</w:t>
       </w:r>
       <w:r>
         <w:rPr>
@@ -455,17 +1020,79 @@
           <w:szCs w:val="22"/>
         </w:rPr>
         <w:br/>
-      </w:r>
-      <w:r>
-        <w:rPr>
-          <w:rStyle w:val="Strong"/>
-          <w:rFonts w:ascii="Helvetica" w:eastAsiaTheme="majorEastAsia" w:hAnsi="Helvetica"/>
-          <w:b w:val="0"/>
-          <w:bCs w:val="0"/>
-          <w:sz w:val="22"/>
-          <w:szCs w:val="22"/>
-        </w:rPr>
-        <w:t>[1] "RingNumber"         "Event"              "Month"              "Year"               "NestNo"             "NestLon"</w:t>
+        <w:t>[1] "</w:t>
+      </w:r>
+      <w:proofErr w:type="spellStart"/>
+      <w:r>
+        <w:rPr>
+          <w:rStyle w:val="Strong"/>
+          <w:rFonts w:ascii="Helvetica" w:eastAsiaTheme="majorEastAsia" w:hAnsi="Helvetica"/>
+          <w:b w:val="0"/>
+          <w:bCs w:val="0"/>
+          <w:sz w:val="22"/>
+          <w:szCs w:val="22"/>
+        </w:rPr>
+        <w:t>RingNumber</w:t>
+      </w:r>
+      <w:proofErr w:type="spellEnd"/>
+      <w:r>
+        <w:rPr>
+          <w:rStyle w:val="Strong"/>
+          <w:rFonts w:ascii="Helvetica" w:eastAsiaTheme="majorEastAsia" w:hAnsi="Helvetica"/>
+          <w:b w:val="0"/>
+          <w:bCs w:val="0"/>
+          <w:sz w:val="22"/>
+          <w:szCs w:val="22"/>
+        </w:rPr>
+        <w:t>"         "Event"              "Month"              "Year"               "</w:t>
+      </w:r>
+      <w:proofErr w:type="spellStart"/>
+      <w:r>
+        <w:rPr>
+          <w:rStyle w:val="Strong"/>
+          <w:rFonts w:ascii="Helvetica" w:eastAsiaTheme="majorEastAsia" w:hAnsi="Helvetica"/>
+          <w:b w:val="0"/>
+          <w:bCs w:val="0"/>
+          <w:sz w:val="22"/>
+          <w:szCs w:val="22"/>
+        </w:rPr>
+        <w:t>NestNo</w:t>
+      </w:r>
+      <w:proofErr w:type="spellEnd"/>
+      <w:r>
+        <w:rPr>
+          <w:rStyle w:val="Strong"/>
+          <w:rFonts w:ascii="Helvetica" w:eastAsiaTheme="majorEastAsia" w:hAnsi="Helvetica"/>
+          <w:b w:val="0"/>
+          <w:bCs w:val="0"/>
+          <w:sz w:val="22"/>
+          <w:szCs w:val="22"/>
+        </w:rPr>
+        <w:t>"             "</w:t>
+      </w:r>
+      <w:proofErr w:type="spellStart"/>
+      <w:r>
+        <w:rPr>
+          <w:rStyle w:val="Strong"/>
+          <w:rFonts w:ascii="Helvetica" w:eastAsiaTheme="majorEastAsia" w:hAnsi="Helvetica"/>
+          <w:b w:val="0"/>
+          <w:bCs w:val="0"/>
+          <w:sz w:val="22"/>
+          <w:szCs w:val="22"/>
+        </w:rPr>
+        <w:t>NestLon</w:t>
+      </w:r>
+      <w:proofErr w:type="spellEnd"/>
+      <w:r>
+        <w:rPr>
+          <w:rStyle w:val="Strong"/>
+          <w:rFonts w:ascii="Helvetica" w:eastAsiaTheme="majorEastAsia" w:hAnsi="Helvetica"/>
+          <w:b w:val="0"/>
+          <w:bCs w:val="0"/>
+          <w:sz w:val="22"/>
+          <w:szCs w:val="22"/>
+        </w:rPr>
+        <w:t>"</w:t>
       </w:r>
       <w:r>
         <w:rPr>
@@ -477,31 +1104,166 @@
           <w:szCs w:val="22"/>
         </w:rPr>
         <w:br/>
-      </w:r>
-      <w:r>
-        <w:rPr>
-          <w:rStyle w:val="Strong"/>
-          <w:rFonts w:ascii="Helvetica" w:eastAsiaTheme="majorEastAsia" w:hAnsi="Helvetica"/>
-          <w:b w:val="0"/>
-          <w:bCs w:val="0"/>
-          <w:sz w:val="22"/>
-          <w:szCs w:val="22"/>
-        </w:rPr>
-        <w:t>[7] "NestLat"            "LayDate"            "ClutchSize"         "PrevLon"            "PrevLat"            "DistanceFromPrev_m"</w:t>
-      </w:r>
-    </w:p>
-    <w:p>
-      <w:pPr>
-        <w:pStyle w:val="NormalWeb"/>
-        <w:rPr>
-          <w:rStyle w:val="Strong"/>
-          <w:rFonts w:ascii="Helvetica" w:eastAsiaTheme="majorEastAsia" w:hAnsi="Helvetica"/>
-          <w:b w:val="0"/>
-          <w:bCs w:val="0"/>
-          <w:sz w:val="22"/>
-          <w:szCs w:val="22"/>
-        </w:rPr>
-      </w:pPr>
+        <w:t>[7] "</w:t>
+      </w:r>
+      <w:proofErr w:type="spellStart"/>
+      <w:r>
+        <w:rPr>
+          <w:rStyle w:val="Strong"/>
+          <w:rFonts w:ascii="Helvetica" w:eastAsiaTheme="majorEastAsia" w:hAnsi="Helvetica"/>
+          <w:b w:val="0"/>
+          <w:bCs w:val="0"/>
+          <w:sz w:val="22"/>
+          <w:szCs w:val="22"/>
+        </w:rPr>
+        <w:t>NestLat</w:t>
+      </w:r>
+      <w:proofErr w:type="spellEnd"/>
+      <w:r>
+        <w:rPr>
+          <w:rStyle w:val="Strong"/>
+          <w:rFonts w:ascii="Helvetica" w:eastAsiaTheme="majorEastAsia" w:hAnsi="Helvetica"/>
+          <w:b w:val="0"/>
+          <w:bCs w:val="0"/>
+          <w:sz w:val="22"/>
+          <w:szCs w:val="22"/>
+        </w:rPr>
+        <w:t>"            "</w:t>
+      </w:r>
+      <w:proofErr w:type="spellStart"/>
+      <w:r>
+        <w:rPr>
+          <w:rStyle w:val="Strong"/>
+          <w:rFonts w:ascii="Helvetica" w:eastAsiaTheme="majorEastAsia" w:hAnsi="Helvetica"/>
+          <w:b w:val="0"/>
+          <w:bCs w:val="0"/>
+          <w:sz w:val="22"/>
+          <w:szCs w:val="22"/>
+        </w:rPr>
+        <w:t>LayDate</w:t>
+      </w:r>
+      <w:proofErr w:type="spellEnd"/>
+      <w:r>
+        <w:rPr>
+          <w:rStyle w:val="Strong"/>
+          <w:rFonts w:ascii="Helvetica" w:eastAsiaTheme="majorEastAsia" w:hAnsi="Helvetica"/>
+          <w:b w:val="0"/>
+          <w:bCs w:val="0"/>
+          <w:sz w:val="22"/>
+          <w:szCs w:val="22"/>
+        </w:rPr>
+        <w:t>"            "</w:t>
+      </w:r>
+      <w:proofErr w:type="spellStart"/>
+      <w:r>
+        <w:rPr>
+          <w:rStyle w:val="Strong"/>
+          <w:rFonts w:ascii="Helvetica" w:eastAsiaTheme="majorEastAsia" w:hAnsi="Helvetica"/>
+          <w:b w:val="0"/>
+          <w:bCs w:val="0"/>
+          <w:sz w:val="22"/>
+          <w:szCs w:val="22"/>
+        </w:rPr>
+        <w:t>ClutchSize</w:t>
+      </w:r>
+      <w:proofErr w:type="spellEnd"/>
+      <w:r>
+        <w:rPr>
+          <w:rStyle w:val="Strong"/>
+          <w:rFonts w:ascii="Helvetica" w:eastAsiaTheme="majorEastAsia" w:hAnsi="Helvetica"/>
+          <w:b w:val="0"/>
+          <w:bCs w:val="0"/>
+          <w:sz w:val="22"/>
+          <w:szCs w:val="22"/>
+        </w:rPr>
+        <w:t>"         "</w:t>
+      </w:r>
+      <w:proofErr w:type="spellStart"/>
+      <w:r>
+        <w:rPr>
+          <w:rStyle w:val="Strong"/>
+          <w:rFonts w:ascii="Helvetica" w:eastAsiaTheme="majorEastAsia" w:hAnsi="Helvetica"/>
+          <w:b w:val="0"/>
+          <w:bCs w:val="0"/>
+          <w:sz w:val="22"/>
+          <w:szCs w:val="22"/>
+        </w:rPr>
+        <w:t>PrevLon</w:t>
+      </w:r>
+      <w:proofErr w:type="spellEnd"/>
+      <w:r>
+        <w:rPr>
+          <w:rStyle w:val="Strong"/>
+          <w:rFonts w:ascii="Helvetica" w:eastAsiaTheme="majorEastAsia" w:hAnsi="Helvetica"/>
+          <w:b w:val="0"/>
+          <w:bCs w:val="0"/>
+          <w:sz w:val="22"/>
+          <w:szCs w:val="22"/>
+        </w:rPr>
+        <w:t>"            "</w:t>
+      </w:r>
+      <w:proofErr w:type="spellStart"/>
+      <w:r>
+        <w:rPr>
+          <w:rStyle w:val="Strong"/>
+          <w:rFonts w:ascii="Helvetica" w:eastAsiaTheme="majorEastAsia" w:hAnsi="Helvetica"/>
+          <w:b w:val="0"/>
+          <w:bCs w:val="0"/>
+          <w:sz w:val="22"/>
+          <w:szCs w:val="22"/>
+        </w:rPr>
+        <w:t>PrevLat</w:t>
+      </w:r>
+      <w:proofErr w:type="spellEnd"/>
+      <w:r>
+        <w:rPr>
+          <w:rStyle w:val="Strong"/>
+          <w:rFonts w:ascii="Helvetica" w:eastAsiaTheme="majorEastAsia" w:hAnsi="Helvetica"/>
+          <w:b w:val="0"/>
+          <w:bCs w:val="0"/>
+          <w:sz w:val="22"/>
+          <w:szCs w:val="22"/>
+        </w:rPr>
+        <w:t>"            "</w:t>
+      </w:r>
+      <w:proofErr w:type="spellStart"/>
+      <w:r>
+        <w:rPr>
+          <w:rStyle w:val="Strong"/>
+          <w:rFonts w:ascii="Helvetica" w:eastAsiaTheme="majorEastAsia" w:hAnsi="Helvetica"/>
+          <w:b w:val="0"/>
+          <w:bCs w:val="0"/>
+          <w:sz w:val="22"/>
+          <w:szCs w:val="22"/>
+        </w:rPr>
+        <w:t>DistanceFromPrev_m</w:t>
+      </w:r>
+      <w:proofErr w:type="spellEnd"/>
+      <w:r>
+        <w:rPr>
+          <w:rStyle w:val="Strong"/>
+          <w:rFonts w:ascii="Helvetica" w:eastAsiaTheme="majorEastAsia" w:hAnsi="Helvetica"/>
+          <w:b w:val="0"/>
+          <w:bCs w:val="0"/>
+          <w:sz w:val="22"/>
+          <w:szCs w:val="22"/>
+        </w:rPr>
+        <w:t>"</w:t>
+      </w:r>
+    </w:p>
+    <w:p>
+      <w:pPr>
+        <w:pStyle w:val="NormalWeb"/>
+        <w:rPr>
+          <w:rStyle w:val="Strong"/>
+          <w:rFonts w:ascii="Helvetica" w:eastAsiaTheme="majorEastAsia" w:hAnsi="Helvetica"/>
+          <w:b w:val="0"/>
+          <w:bCs w:val="0"/>
+          <w:sz w:val="22"/>
+          <w:szCs w:val="22"/>
+        </w:rPr>
+      </w:pPr>
+      <w:proofErr w:type="spellStart"/>
       <w:r>
         <w:rPr>
           <w:rStyle w:val="Strong"/>
@@ -513,6 +1275,7 @@
         </w:rPr>
         <w:t>IndividualInfo</w:t>
       </w:r>
+      <w:proofErr w:type="spellEnd"/>
       <w:r>
         <w:rPr>
           <w:rStyle w:val="Strong"/>
@@ -544,7 +1307,55 @@
           <w:sz w:val="22"/>
           <w:szCs w:val="22"/>
         </w:rPr>
-        <w:t>[1] "RingNumber"          "Mother"              "Father"              "BroodID"             "Sex"</w:t>
+        <w:t>[1] "</w:t>
+      </w:r>
+      <w:proofErr w:type="spellStart"/>
+      <w:r>
+        <w:rPr>
+          <w:rStyle w:val="Strong"/>
+          <w:rFonts w:ascii="Helvetica" w:eastAsiaTheme="majorEastAsia" w:hAnsi="Helvetica"/>
+          <w:b w:val="0"/>
+          <w:bCs w:val="0"/>
+          <w:sz w:val="22"/>
+          <w:szCs w:val="22"/>
+        </w:rPr>
+        <w:t>RingNumber</w:t>
+      </w:r>
+      <w:proofErr w:type="spellEnd"/>
+      <w:r>
+        <w:rPr>
+          <w:rStyle w:val="Strong"/>
+          <w:rFonts w:ascii="Helvetica" w:eastAsiaTheme="majorEastAsia" w:hAnsi="Helvetica"/>
+          <w:b w:val="0"/>
+          <w:bCs w:val="0"/>
+          <w:sz w:val="22"/>
+          <w:szCs w:val="22"/>
+        </w:rPr>
+        <w:t>"          "Mother"              "Father"              "</w:t>
+      </w:r>
+      <w:proofErr w:type="spellStart"/>
+      <w:r>
+        <w:rPr>
+          <w:rStyle w:val="Strong"/>
+          <w:rFonts w:ascii="Helvetica" w:eastAsiaTheme="majorEastAsia" w:hAnsi="Helvetica"/>
+          <w:b w:val="0"/>
+          <w:bCs w:val="0"/>
+          <w:sz w:val="22"/>
+          <w:szCs w:val="22"/>
+        </w:rPr>
+        <w:t>BroodID</w:t>
+      </w:r>
+      <w:proofErr w:type="spellEnd"/>
+      <w:r>
+        <w:rPr>
+          <w:rStyle w:val="Strong"/>
+          <w:rFonts w:ascii="Helvetica" w:eastAsiaTheme="majorEastAsia" w:hAnsi="Helvetica"/>
+          <w:b w:val="0"/>
+          <w:bCs w:val="0"/>
+          <w:sz w:val="22"/>
+          <w:szCs w:val="22"/>
+        </w:rPr>
+        <w:t>"             "Sex"</w:t>
       </w:r>
       <w:r>
         <w:rPr>
@@ -566,7 +1377,127 @@
           <w:sz w:val="22"/>
           <w:szCs w:val="22"/>
         </w:rPr>
-        <w:t xml:space="preserve">[6] "RingYear"            "BirthYear"           "RingPopulationName"  "RingNestBox"         "RingLatitude" </w:t>
+        <w:t>[6] "</w:t>
+      </w:r>
+      <w:proofErr w:type="spellStart"/>
+      <w:r>
+        <w:rPr>
+          <w:rStyle w:val="Strong"/>
+          <w:rFonts w:ascii="Helvetica" w:eastAsiaTheme="majorEastAsia" w:hAnsi="Helvetica"/>
+          <w:b w:val="0"/>
+          <w:bCs w:val="0"/>
+          <w:sz w:val="22"/>
+          <w:szCs w:val="22"/>
+        </w:rPr>
+        <w:t>RingYear</w:t>
+      </w:r>
+      <w:proofErr w:type="spellEnd"/>
+      <w:r>
+        <w:rPr>
+          <w:rStyle w:val="Strong"/>
+          <w:rFonts w:ascii="Helvetica" w:eastAsiaTheme="majorEastAsia" w:hAnsi="Helvetica"/>
+          <w:b w:val="0"/>
+          <w:bCs w:val="0"/>
+          <w:sz w:val="22"/>
+          <w:szCs w:val="22"/>
+        </w:rPr>
+        <w:t>"            "</w:t>
+      </w:r>
+      <w:proofErr w:type="spellStart"/>
+      <w:r>
+        <w:rPr>
+          <w:rStyle w:val="Strong"/>
+          <w:rFonts w:ascii="Helvetica" w:eastAsiaTheme="majorEastAsia" w:hAnsi="Helvetica"/>
+          <w:b w:val="0"/>
+          <w:bCs w:val="0"/>
+          <w:sz w:val="22"/>
+          <w:szCs w:val="22"/>
+        </w:rPr>
+        <w:t>BirthYear</w:t>
+      </w:r>
+      <w:proofErr w:type="spellEnd"/>
+      <w:r>
+        <w:rPr>
+          <w:rStyle w:val="Strong"/>
+          <w:rFonts w:ascii="Helvetica" w:eastAsiaTheme="majorEastAsia" w:hAnsi="Helvetica"/>
+          <w:b w:val="0"/>
+          <w:bCs w:val="0"/>
+          <w:sz w:val="22"/>
+          <w:szCs w:val="22"/>
+        </w:rPr>
+        <w:t>"           "</w:t>
+      </w:r>
+      <w:proofErr w:type="spellStart"/>
+      <w:r>
+        <w:rPr>
+          <w:rStyle w:val="Strong"/>
+          <w:rFonts w:ascii="Helvetica" w:eastAsiaTheme="majorEastAsia" w:hAnsi="Helvetica"/>
+          <w:b w:val="0"/>
+          <w:bCs w:val="0"/>
+          <w:sz w:val="22"/>
+          <w:szCs w:val="22"/>
+        </w:rPr>
+        <w:t>RingPopulationName</w:t>
+      </w:r>
+      <w:proofErr w:type="spellEnd"/>
+      <w:r>
+        <w:rPr>
+          <w:rStyle w:val="Strong"/>
+          <w:rFonts w:ascii="Helvetica" w:eastAsiaTheme="majorEastAsia" w:hAnsi="Helvetica"/>
+          <w:b w:val="0"/>
+          <w:bCs w:val="0"/>
+          <w:sz w:val="22"/>
+          <w:szCs w:val="22"/>
+        </w:rPr>
+        <w:t>"  "</w:t>
+      </w:r>
+      <w:proofErr w:type="spellStart"/>
+      <w:r>
+        <w:rPr>
+          <w:rStyle w:val="Strong"/>
+          <w:rFonts w:ascii="Helvetica" w:eastAsiaTheme="majorEastAsia" w:hAnsi="Helvetica"/>
+          <w:b w:val="0"/>
+          <w:bCs w:val="0"/>
+          <w:sz w:val="22"/>
+          <w:szCs w:val="22"/>
+        </w:rPr>
+        <w:t>RingNestBox</w:t>
+      </w:r>
+      <w:proofErr w:type="spellEnd"/>
+      <w:r>
+        <w:rPr>
+          <w:rStyle w:val="Strong"/>
+          <w:rFonts w:ascii="Helvetica" w:eastAsiaTheme="majorEastAsia" w:hAnsi="Helvetica"/>
+          <w:b w:val="0"/>
+          <w:bCs w:val="0"/>
+          <w:sz w:val="22"/>
+          <w:szCs w:val="22"/>
+        </w:rPr>
+        <w:t>"         "</w:t>
+      </w:r>
+      <w:proofErr w:type="spellStart"/>
+      <w:r>
+        <w:rPr>
+          <w:rStyle w:val="Strong"/>
+          <w:rFonts w:ascii="Helvetica" w:eastAsiaTheme="majorEastAsia" w:hAnsi="Helvetica"/>
+          <w:b w:val="0"/>
+          <w:bCs w:val="0"/>
+          <w:sz w:val="22"/>
+          <w:szCs w:val="22"/>
+        </w:rPr>
+        <w:t>RingLatitude</w:t>
+      </w:r>
+      <w:proofErr w:type="spellEnd"/>
+      <w:r>
+        <w:rPr>
+          <w:rStyle w:val="Strong"/>
+          <w:rFonts w:ascii="Helvetica" w:eastAsiaTheme="majorEastAsia" w:hAnsi="Helvetica"/>
+          <w:b w:val="0"/>
+          <w:bCs w:val="0"/>
+          <w:sz w:val="22"/>
+          <w:szCs w:val="22"/>
+        </w:rPr>
+        <w:t xml:space="preserve">" </w:t>
       </w:r>
       <w:r>
         <w:rPr>
@@ -588,7 +1519,55 @@
           <w:sz w:val="22"/>
           <w:szCs w:val="22"/>
         </w:rPr>
-        <w:t>[11] "RingLongitude"       "Species"             "RingColour"          "ColourRingLeft1"     "ColourRingLeft2"</w:t>
+        <w:t>[11] "</w:t>
+      </w:r>
+      <w:proofErr w:type="spellStart"/>
+      <w:r>
+        <w:rPr>
+          <w:rStyle w:val="Strong"/>
+          <w:rFonts w:ascii="Helvetica" w:eastAsiaTheme="majorEastAsia" w:hAnsi="Helvetica"/>
+          <w:b w:val="0"/>
+          <w:bCs w:val="0"/>
+          <w:sz w:val="22"/>
+          <w:szCs w:val="22"/>
+        </w:rPr>
+        <w:t>RingLongitude</w:t>
+      </w:r>
+      <w:proofErr w:type="spellEnd"/>
+      <w:r>
+        <w:rPr>
+          <w:rStyle w:val="Strong"/>
+          <w:rFonts w:ascii="Helvetica" w:eastAsiaTheme="majorEastAsia" w:hAnsi="Helvetica"/>
+          <w:b w:val="0"/>
+          <w:bCs w:val="0"/>
+          <w:sz w:val="22"/>
+          <w:szCs w:val="22"/>
+        </w:rPr>
+        <w:t>"       "Species"             "</w:t>
+      </w:r>
+      <w:proofErr w:type="spellStart"/>
+      <w:r>
+        <w:rPr>
+          <w:rStyle w:val="Strong"/>
+          <w:rFonts w:ascii="Helvetica" w:eastAsiaTheme="majorEastAsia" w:hAnsi="Helvetica"/>
+          <w:b w:val="0"/>
+          <w:bCs w:val="0"/>
+          <w:sz w:val="22"/>
+          <w:szCs w:val="22"/>
+        </w:rPr>
+        <w:t>RingColour</w:t>
+      </w:r>
+      <w:proofErr w:type="spellEnd"/>
+      <w:r>
+        <w:rPr>
+          <w:rStyle w:val="Strong"/>
+          <w:rFonts w:ascii="Helvetica" w:eastAsiaTheme="majorEastAsia" w:hAnsi="Helvetica"/>
+          <w:b w:val="0"/>
+          <w:bCs w:val="0"/>
+          <w:sz w:val="22"/>
+          <w:szCs w:val="22"/>
+        </w:rPr>
+        <w:t>"          "ColourRingLeft1"     "ColourRingLeft2"</w:t>
       </w:r>
       <w:r>
         <w:rPr>
@@ -610,7 +1589,55 @@
           <w:sz w:val="22"/>
           <w:szCs w:val="22"/>
         </w:rPr>
-        <w:t>[16] "ColourRingRight1"    "ColourRingRight2"    "ColourRingCombo"     "NumNestSites"        "BreedingAttempts"</w:t>
+        <w:t>[16] "ColourRingRight1"    "ColourRingRight2"    "</w:t>
+      </w:r>
+      <w:proofErr w:type="spellStart"/>
+      <w:r>
+        <w:rPr>
+          <w:rStyle w:val="Strong"/>
+          <w:rFonts w:ascii="Helvetica" w:eastAsiaTheme="majorEastAsia" w:hAnsi="Helvetica"/>
+          <w:b w:val="0"/>
+          <w:bCs w:val="0"/>
+          <w:sz w:val="22"/>
+          <w:szCs w:val="22"/>
+        </w:rPr>
+        <w:t>ColourRingCombo</w:t>
+      </w:r>
+      <w:proofErr w:type="spellEnd"/>
+      <w:r>
+        <w:rPr>
+          <w:rStyle w:val="Strong"/>
+          <w:rFonts w:ascii="Helvetica" w:eastAsiaTheme="majorEastAsia" w:hAnsi="Helvetica"/>
+          <w:b w:val="0"/>
+          <w:bCs w:val="0"/>
+          <w:sz w:val="22"/>
+          <w:szCs w:val="22"/>
+        </w:rPr>
+        <w:t>"     "NumNestSites"        "</w:t>
+      </w:r>
+      <w:proofErr w:type="spellStart"/>
+      <w:r>
+        <w:rPr>
+          <w:rStyle w:val="Strong"/>
+          <w:rFonts w:ascii="Helvetica" w:eastAsiaTheme="majorEastAsia" w:hAnsi="Helvetica"/>
+          <w:b w:val="0"/>
+          <w:bCs w:val="0"/>
+          <w:sz w:val="22"/>
+          <w:szCs w:val="22"/>
+        </w:rPr>
+        <w:t>BreedingAttempts</w:t>
+      </w:r>
+      <w:proofErr w:type="spellEnd"/>
+      <w:r>
+        <w:rPr>
+          <w:rStyle w:val="Strong"/>
+          <w:rFonts w:ascii="Helvetica" w:eastAsiaTheme="majorEastAsia" w:hAnsi="Helvetica"/>
+          <w:b w:val="0"/>
+          <w:bCs w:val="0"/>
+          <w:sz w:val="22"/>
+          <w:szCs w:val="22"/>
+        </w:rPr>
+        <w:t>"</w:t>
       </w:r>
       <w:r>
         <w:rPr>
@@ -632,7 +1659,127 @@
           <w:sz w:val="22"/>
           <w:szCs w:val="22"/>
         </w:rPr>
-        <w:t>[21] "FirstBreedingYear"   "LastBreedingYear"    "BreedingSpan"        "MeanClutchSize"      "MinClutchSize"</w:t>
+        <w:t>[21] "</w:t>
+      </w:r>
+      <w:proofErr w:type="spellStart"/>
+      <w:r>
+        <w:rPr>
+          <w:rStyle w:val="Strong"/>
+          <w:rFonts w:ascii="Helvetica" w:eastAsiaTheme="majorEastAsia" w:hAnsi="Helvetica"/>
+          <w:b w:val="0"/>
+          <w:bCs w:val="0"/>
+          <w:sz w:val="22"/>
+          <w:szCs w:val="22"/>
+        </w:rPr>
+        <w:t>FirstBreedingYear</w:t>
+      </w:r>
+      <w:proofErr w:type="spellEnd"/>
+      <w:r>
+        <w:rPr>
+          <w:rStyle w:val="Strong"/>
+          <w:rFonts w:ascii="Helvetica" w:eastAsiaTheme="majorEastAsia" w:hAnsi="Helvetica"/>
+          <w:b w:val="0"/>
+          <w:bCs w:val="0"/>
+          <w:sz w:val="22"/>
+          <w:szCs w:val="22"/>
+        </w:rPr>
+        <w:t>"   "</w:t>
+      </w:r>
+      <w:proofErr w:type="spellStart"/>
+      <w:r>
+        <w:rPr>
+          <w:rStyle w:val="Strong"/>
+          <w:rFonts w:ascii="Helvetica" w:eastAsiaTheme="majorEastAsia" w:hAnsi="Helvetica"/>
+          <w:b w:val="0"/>
+          <w:bCs w:val="0"/>
+          <w:sz w:val="22"/>
+          <w:szCs w:val="22"/>
+        </w:rPr>
+        <w:t>LastBreedingYear</w:t>
+      </w:r>
+      <w:proofErr w:type="spellEnd"/>
+      <w:r>
+        <w:rPr>
+          <w:rStyle w:val="Strong"/>
+          <w:rFonts w:ascii="Helvetica" w:eastAsiaTheme="majorEastAsia" w:hAnsi="Helvetica"/>
+          <w:b w:val="0"/>
+          <w:bCs w:val="0"/>
+          <w:sz w:val="22"/>
+          <w:szCs w:val="22"/>
+        </w:rPr>
+        <w:t>"    "</w:t>
+      </w:r>
+      <w:proofErr w:type="spellStart"/>
+      <w:r>
+        <w:rPr>
+          <w:rStyle w:val="Strong"/>
+          <w:rFonts w:ascii="Helvetica" w:eastAsiaTheme="majorEastAsia" w:hAnsi="Helvetica"/>
+          <w:b w:val="0"/>
+          <w:bCs w:val="0"/>
+          <w:sz w:val="22"/>
+          <w:szCs w:val="22"/>
+        </w:rPr>
+        <w:t>BreedingSpan</w:t>
+      </w:r>
+      <w:proofErr w:type="spellEnd"/>
+      <w:r>
+        <w:rPr>
+          <w:rStyle w:val="Strong"/>
+          <w:rFonts w:ascii="Helvetica" w:eastAsiaTheme="majorEastAsia" w:hAnsi="Helvetica"/>
+          <w:b w:val="0"/>
+          <w:bCs w:val="0"/>
+          <w:sz w:val="22"/>
+          <w:szCs w:val="22"/>
+        </w:rPr>
+        <w:t>"        "</w:t>
+      </w:r>
+      <w:proofErr w:type="spellStart"/>
+      <w:r>
+        <w:rPr>
+          <w:rStyle w:val="Strong"/>
+          <w:rFonts w:ascii="Helvetica" w:eastAsiaTheme="majorEastAsia" w:hAnsi="Helvetica"/>
+          <w:b w:val="0"/>
+          <w:bCs w:val="0"/>
+          <w:sz w:val="22"/>
+          <w:szCs w:val="22"/>
+        </w:rPr>
+        <w:t>MeanClutchSize</w:t>
+      </w:r>
+      <w:proofErr w:type="spellEnd"/>
+      <w:r>
+        <w:rPr>
+          <w:rStyle w:val="Strong"/>
+          <w:rFonts w:ascii="Helvetica" w:eastAsiaTheme="majorEastAsia" w:hAnsi="Helvetica"/>
+          <w:b w:val="0"/>
+          <w:bCs w:val="0"/>
+          <w:sz w:val="22"/>
+          <w:szCs w:val="22"/>
+        </w:rPr>
+        <w:t>"      "</w:t>
+      </w:r>
+      <w:proofErr w:type="spellStart"/>
+      <w:r>
+        <w:rPr>
+          <w:rStyle w:val="Strong"/>
+          <w:rFonts w:ascii="Helvetica" w:eastAsiaTheme="majorEastAsia" w:hAnsi="Helvetica"/>
+          <w:b w:val="0"/>
+          <w:bCs w:val="0"/>
+          <w:sz w:val="22"/>
+          <w:szCs w:val="22"/>
+        </w:rPr>
+        <w:t>MinClutchSize</w:t>
+      </w:r>
+      <w:proofErr w:type="spellEnd"/>
+      <w:r>
+        <w:rPr>
+          <w:rStyle w:val="Strong"/>
+          <w:rFonts w:ascii="Helvetica" w:eastAsiaTheme="majorEastAsia" w:hAnsi="Helvetica"/>
+          <w:b w:val="0"/>
+          <w:bCs w:val="0"/>
+          <w:sz w:val="22"/>
+          <w:szCs w:val="22"/>
+        </w:rPr>
+        <w:t>"</w:t>
       </w:r>
       <w:r>
         <w:rPr>
@@ -655,8 +1802,117 @@
           <w:szCs w:val="22"/>
         </w:rPr>
         <w:lastRenderedPageBreak/>
-        <w:t>[26] "MaxClutchSize"       "TotalEggs"           "MotherRingColour"    "FatherRingColour"    "DispersalDistance_m</w:t>
-      </w:r>
+        <w:t>[26] "</w:t>
+      </w:r>
+      <w:proofErr w:type="spellStart"/>
+      <w:r>
+        <w:rPr>
+          <w:rStyle w:val="Strong"/>
+          <w:rFonts w:ascii="Helvetica" w:eastAsiaTheme="majorEastAsia" w:hAnsi="Helvetica"/>
+          <w:b w:val="0"/>
+          <w:bCs w:val="0"/>
+          <w:sz w:val="22"/>
+          <w:szCs w:val="22"/>
+        </w:rPr>
+        <w:t>MaxClutchSize</w:t>
+      </w:r>
+      <w:proofErr w:type="spellEnd"/>
+      <w:r>
+        <w:rPr>
+          <w:rStyle w:val="Strong"/>
+          <w:rFonts w:ascii="Helvetica" w:eastAsiaTheme="majorEastAsia" w:hAnsi="Helvetica"/>
+          <w:b w:val="0"/>
+          <w:bCs w:val="0"/>
+          <w:sz w:val="22"/>
+          <w:szCs w:val="22"/>
+        </w:rPr>
+        <w:t>"       "</w:t>
+      </w:r>
+      <w:proofErr w:type="spellStart"/>
+      <w:r>
+        <w:rPr>
+          <w:rStyle w:val="Strong"/>
+          <w:rFonts w:ascii="Helvetica" w:eastAsiaTheme="majorEastAsia" w:hAnsi="Helvetica"/>
+          <w:b w:val="0"/>
+          <w:bCs w:val="0"/>
+          <w:sz w:val="22"/>
+          <w:szCs w:val="22"/>
+        </w:rPr>
+        <w:t>TotalEggs</w:t>
+      </w:r>
+      <w:proofErr w:type="spellEnd"/>
+      <w:r>
+        <w:rPr>
+          <w:rStyle w:val="Strong"/>
+          <w:rFonts w:ascii="Helvetica" w:eastAsiaTheme="majorEastAsia" w:hAnsi="Helvetica"/>
+          <w:b w:val="0"/>
+          <w:bCs w:val="0"/>
+          <w:sz w:val="22"/>
+          <w:szCs w:val="22"/>
+        </w:rPr>
+        <w:t>"           "</w:t>
+      </w:r>
+      <w:proofErr w:type="spellStart"/>
+      <w:r>
+        <w:rPr>
+          <w:rStyle w:val="Strong"/>
+          <w:rFonts w:ascii="Helvetica" w:eastAsiaTheme="majorEastAsia" w:hAnsi="Helvetica"/>
+          <w:b w:val="0"/>
+          <w:bCs w:val="0"/>
+          <w:sz w:val="22"/>
+          <w:szCs w:val="22"/>
+        </w:rPr>
+        <w:t>MotherRingColour</w:t>
+      </w:r>
+      <w:proofErr w:type="spellEnd"/>
+      <w:r>
+        <w:rPr>
+          <w:rStyle w:val="Strong"/>
+          <w:rFonts w:ascii="Helvetica" w:eastAsiaTheme="majorEastAsia" w:hAnsi="Helvetica"/>
+          <w:b w:val="0"/>
+          <w:bCs w:val="0"/>
+          <w:sz w:val="22"/>
+          <w:szCs w:val="22"/>
+        </w:rPr>
+        <w:t>"    "</w:t>
+      </w:r>
+      <w:proofErr w:type="spellStart"/>
+      <w:r>
+        <w:rPr>
+          <w:rStyle w:val="Strong"/>
+          <w:rFonts w:ascii="Helvetica" w:eastAsiaTheme="majorEastAsia" w:hAnsi="Helvetica"/>
+          <w:b w:val="0"/>
+          <w:bCs w:val="0"/>
+          <w:sz w:val="22"/>
+          <w:szCs w:val="22"/>
+        </w:rPr>
+        <w:t>FatherRingColour</w:t>
+      </w:r>
+      <w:proofErr w:type="spellEnd"/>
+      <w:r>
+        <w:rPr>
+          <w:rStyle w:val="Strong"/>
+          <w:rFonts w:ascii="Helvetica" w:eastAsiaTheme="majorEastAsia" w:hAnsi="Helvetica"/>
+          <w:b w:val="0"/>
+          <w:bCs w:val="0"/>
+          <w:sz w:val="22"/>
+          <w:szCs w:val="22"/>
+        </w:rPr>
+        <w:t>"    "</w:t>
+      </w:r>
+      <w:proofErr w:type="spellStart"/>
+      <w:r>
+        <w:rPr>
+          <w:rStyle w:val="Strong"/>
+          <w:rFonts w:ascii="Helvetica" w:eastAsiaTheme="majorEastAsia" w:hAnsi="Helvetica"/>
+          <w:b w:val="0"/>
+          <w:bCs w:val="0"/>
+          <w:sz w:val="22"/>
+          <w:szCs w:val="22"/>
+        </w:rPr>
+        <w:t>DispersalDistance_m</w:t>
+      </w:r>
+      <w:proofErr w:type="spellEnd"/>
       <w:r>
         <w:rPr>
           <w:rStyle w:val="Strong"/>
@@ -688,7 +1944,55 @@
           <w:sz w:val="22"/>
           <w:szCs w:val="22"/>
         </w:rPr>
-        <w:t>[31] "TotalDistance_m"     "SexText"</w:t>
+        <w:t>[31] "</w:t>
+      </w:r>
+      <w:proofErr w:type="spellStart"/>
+      <w:r>
+        <w:rPr>
+          <w:rStyle w:val="Strong"/>
+          <w:rFonts w:ascii="Helvetica" w:eastAsiaTheme="majorEastAsia" w:hAnsi="Helvetica"/>
+          <w:b w:val="0"/>
+          <w:bCs w:val="0"/>
+          <w:sz w:val="22"/>
+          <w:szCs w:val="22"/>
+        </w:rPr>
+        <w:t>TotalDistance_m</w:t>
+      </w:r>
+      <w:proofErr w:type="spellEnd"/>
+      <w:r>
+        <w:rPr>
+          <w:rStyle w:val="Strong"/>
+          <w:rFonts w:ascii="Helvetica" w:eastAsiaTheme="majorEastAsia" w:hAnsi="Helvetica"/>
+          <w:b w:val="0"/>
+          <w:bCs w:val="0"/>
+          <w:sz w:val="22"/>
+          <w:szCs w:val="22"/>
+        </w:rPr>
+        <w:t>"     "</w:t>
+      </w:r>
+      <w:proofErr w:type="spellStart"/>
+      <w:r>
+        <w:rPr>
+          <w:rStyle w:val="Strong"/>
+          <w:rFonts w:ascii="Helvetica" w:eastAsiaTheme="majorEastAsia" w:hAnsi="Helvetica"/>
+          <w:b w:val="0"/>
+          <w:bCs w:val="0"/>
+          <w:sz w:val="22"/>
+          <w:szCs w:val="22"/>
+        </w:rPr>
+        <w:t>SexText</w:t>
+      </w:r>
+      <w:proofErr w:type="spellEnd"/>
+      <w:r>
+        <w:rPr>
+          <w:rStyle w:val="Strong"/>
+          <w:rFonts w:ascii="Helvetica" w:eastAsiaTheme="majorEastAsia" w:hAnsi="Helvetica"/>
+          <w:b w:val="0"/>
+          <w:bCs w:val="0"/>
+          <w:sz w:val="22"/>
+          <w:szCs w:val="22"/>
+        </w:rPr>
+        <w:t>"</w:t>
       </w:r>
     </w:p>
     <w:p>
@@ -778,7 +2082,21 @@
         <w:rPr>
           <w:rFonts w:ascii="Helvetica" w:hAnsi="Helvetica"/>
         </w:rPr>
-        <w:t>I removed any individuals not from Vlieland as they seem to have a different colour rings system (sometime more than four rings, different colours</w:t>
+        <w:t xml:space="preserve">I removed any individuals not from </w:t>
+      </w:r>
+      <w:proofErr w:type="spellStart"/>
+      <w:r>
+        <w:rPr>
+          <w:rFonts w:ascii="Helvetica" w:hAnsi="Helvetica"/>
+        </w:rPr>
+        <w:t>Vlieland</w:t>
+      </w:r>
+      <w:proofErr w:type="spellEnd"/>
+      <w:r>
+        <w:rPr>
+          <w:rFonts w:ascii="Helvetica" w:hAnsi="Helvetica"/>
+        </w:rPr>
+        <w:t xml:space="preserve"> as they seem to have a different colour rings system (sometime more than four rings, different colours</w:t>
       </w:r>
       <w:r>
         <w:rPr>
@@ -824,7 +2142,35 @@
         <w:rPr>
           <w:rFonts w:ascii="Helvetica" w:hAnsi="Helvetica"/>
         </w:rPr>
-        <w:t>Not all individuals in BroodData appear in IndividualData and vice versa</w:t>
+        <w:t xml:space="preserve">Not all individuals in </w:t>
+      </w:r>
+      <w:proofErr w:type="spellStart"/>
+      <w:r>
+        <w:rPr>
+          <w:rFonts w:ascii="Helvetica" w:hAnsi="Helvetica"/>
+        </w:rPr>
+        <w:t>BroodData</w:t>
+      </w:r>
+      <w:proofErr w:type="spellEnd"/>
+      <w:r>
+        <w:rPr>
+          <w:rFonts w:ascii="Helvetica" w:hAnsi="Helvetica"/>
+        </w:rPr>
+        <w:t xml:space="preserve"> appear in </w:t>
+      </w:r>
+      <w:proofErr w:type="spellStart"/>
+      <w:r>
+        <w:rPr>
+          <w:rFonts w:ascii="Helvetica" w:hAnsi="Helvetica"/>
+        </w:rPr>
+        <w:t>IndividualData</w:t>
+      </w:r>
+      <w:proofErr w:type="spellEnd"/>
+      <w:r>
+        <w:rPr>
+          <w:rFonts w:ascii="Helvetica" w:hAnsi="Helvetica"/>
+        </w:rPr>
+        <w:t xml:space="preserve"> and vice versa</w:t>
       </w:r>
     </w:p>
     <w:p>
@@ -859,7 +2205,35 @@
         <w:rPr>
           <w:rFonts w:ascii="Helvetica" w:hAnsi="Helvetica"/>
         </w:rPr>
-        <w:t>One row had a laydate in October 2026 so I removed this line</w:t>
+        <w:t xml:space="preserve">One row had a </w:t>
+      </w:r>
+      <w:proofErr w:type="spellStart"/>
+      <w:r>
+        <w:rPr>
+          <w:rFonts w:ascii="Helvetica" w:hAnsi="Helvetica"/>
+        </w:rPr>
+        <w:t>laydate</w:t>
+      </w:r>
+      <w:proofErr w:type="spellEnd"/>
+      <w:r>
+        <w:rPr>
+          <w:rFonts w:ascii="Helvetica" w:hAnsi="Helvetica"/>
+        </w:rPr>
+        <w:t xml:space="preserve"> in October </w:t>
+      </w:r>
+      <w:proofErr w:type="gramStart"/>
+      <w:r>
+        <w:rPr>
+          <w:rFonts w:ascii="Helvetica" w:hAnsi="Helvetica"/>
+        </w:rPr>
+        <w:t>2026</w:t>
+      </w:r>
+      <w:proofErr w:type="gramEnd"/>
+      <w:r>
+        <w:rPr>
+          <w:rFonts w:ascii="Helvetica" w:hAnsi="Helvetica"/>
+        </w:rPr>
+        <w:t xml:space="preserve"> so I removed this line</w:t>
       </w:r>
     </w:p>
     <w:p>
@@ -895,7 +2269,21 @@
         <w:rPr>
           <w:rFonts w:ascii="Helvetica" w:hAnsi="Helvetica"/>
         </w:rPr>
-        <w:t xml:space="preserve"> father in individual data but do appear as female or male in BroodData </w:t>
+        <w:t xml:space="preserve"> father in individual data but do appear as female or male in </w:t>
+      </w:r>
+      <w:proofErr w:type="spellStart"/>
+      <w:r>
+        <w:rPr>
+          <w:rFonts w:ascii="Helvetica" w:hAnsi="Helvetica"/>
+        </w:rPr>
+        <w:t>BroodData</w:t>
+      </w:r>
+      <w:proofErr w:type="spellEnd"/>
+      <w:r>
+        <w:rPr>
+          <w:rFonts w:ascii="Helvetica" w:hAnsi="Helvetica"/>
+        </w:rPr>
+        <w:t xml:space="preserve"> </w:t>
       </w:r>
       <w:r>
         <w:rPr>
@@ -907,7 +2295,21 @@
         <w:rPr>
           <w:rFonts w:ascii="Helvetica" w:hAnsi="Helvetica"/>
         </w:rPr>
-        <w:t>the BroodID doesn’t appear in individual data</w:t>
+        <w:t xml:space="preserve">the </w:t>
+      </w:r>
+      <w:proofErr w:type="spellStart"/>
+      <w:r>
+        <w:rPr>
+          <w:rFonts w:ascii="Helvetica" w:hAnsi="Helvetica"/>
+        </w:rPr>
+        <w:t>BroodID</w:t>
+      </w:r>
+      <w:proofErr w:type="spellEnd"/>
+      <w:r>
+        <w:rPr>
+          <w:rFonts w:ascii="Helvetica" w:hAnsi="Helvetica"/>
+        </w:rPr>
+        <w:t xml:space="preserve"> doesn’t appear in individual data</w:t>
       </w:r>
     </w:p>
     <w:p>
@@ -952,7 +2354,49 @@
         <w:rPr>
           <w:rFonts w:ascii="Helvetica" w:hAnsi="Helvetica"/>
         </w:rPr>
-        <w:t>Even when RingYear = BirthYear, the NestBox Number and locations sometimes no not match between birth and ring events</w:t>
+        <w:t xml:space="preserve">Even when </w:t>
+      </w:r>
+      <w:proofErr w:type="spellStart"/>
+      <w:r>
+        <w:rPr>
+          <w:rFonts w:ascii="Helvetica" w:hAnsi="Helvetica"/>
+        </w:rPr>
+        <w:t>RingYear</w:t>
+      </w:r>
+      <w:proofErr w:type="spellEnd"/>
+      <w:r>
+        <w:rPr>
+          <w:rFonts w:ascii="Helvetica" w:hAnsi="Helvetica"/>
+        </w:rPr>
+        <w:t xml:space="preserve"> = </w:t>
+      </w:r>
+      <w:proofErr w:type="spellStart"/>
+      <w:r>
+        <w:rPr>
+          <w:rFonts w:ascii="Helvetica" w:hAnsi="Helvetica"/>
+        </w:rPr>
+        <w:t>BirthYear</w:t>
+      </w:r>
+      <w:proofErr w:type="spellEnd"/>
+      <w:r>
+        <w:rPr>
+          <w:rFonts w:ascii="Helvetica" w:hAnsi="Helvetica"/>
+        </w:rPr>
+        <w:t xml:space="preserve">, the </w:t>
+      </w:r>
+      <w:proofErr w:type="spellStart"/>
+      <w:r>
+        <w:rPr>
+          <w:rFonts w:ascii="Helvetica" w:hAnsi="Helvetica"/>
+        </w:rPr>
+        <w:t>NestBox</w:t>
+      </w:r>
+      <w:proofErr w:type="spellEnd"/>
+      <w:r>
+        <w:rPr>
+          <w:rFonts w:ascii="Helvetica" w:hAnsi="Helvetica"/>
+        </w:rPr>
+        <w:t xml:space="preserve"> Number and locations sometimes no not match between birth and ring events</w:t>
       </w:r>
     </w:p>
     <w:p>
@@ -972,7 +2416,35 @@
         <w:rPr>
           <w:rFonts w:ascii="Helvetica" w:hAnsi="Helvetica"/>
         </w:rPr>
-        <w:t>I think RingYear and BirthYear should be the same for birds ringed as nestling</w:t>
+        <w:t xml:space="preserve">I think </w:t>
+      </w:r>
+      <w:proofErr w:type="spellStart"/>
+      <w:r>
+        <w:rPr>
+          <w:rFonts w:ascii="Helvetica" w:hAnsi="Helvetica"/>
+        </w:rPr>
+        <w:t>RingYear</w:t>
+      </w:r>
+      <w:proofErr w:type="spellEnd"/>
+      <w:r>
+        <w:rPr>
+          <w:rFonts w:ascii="Helvetica" w:hAnsi="Helvetica"/>
+        </w:rPr>
+        <w:t xml:space="preserve"> and </w:t>
+      </w:r>
+      <w:proofErr w:type="spellStart"/>
+      <w:r>
+        <w:rPr>
+          <w:rFonts w:ascii="Helvetica" w:hAnsi="Helvetica"/>
+        </w:rPr>
+        <w:t>BirthYear</w:t>
+      </w:r>
+      <w:proofErr w:type="spellEnd"/>
+      <w:r>
+        <w:rPr>
+          <w:rFonts w:ascii="Helvetica" w:hAnsi="Helvetica"/>
+        </w:rPr>
+        <w:t xml:space="preserve"> should be the same for birds ringed as nestling</w:t>
       </w:r>
       <w:r>
         <w:rPr>
@@ -1036,14 +2508,34 @@
         </w:rPr>
         <w:t xml:space="preserve"> missing but </w:t>
       </w:r>
+      <w:proofErr w:type="spellStart"/>
       <w:r>
         <w:rPr>
           <w:rFonts w:ascii="Helvetica" w:hAnsi="Helvetica" w:cs="Courier New"/>
           <w:sz w:val="20"/>
           <w:szCs w:val="20"/>
         </w:rPr>
-        <w:t>BirthYear = RingYear</w:t>
-      </w:r>
+        <w:t>BirthYear</w:t>
+      </w:r>
+      <w:proofErr w:type="spellEnd"/>
+      <w:r>
+        <w:rPr>
+          <w:rFonts w:ascii="Helvetica" w:hAnsi="Helvetica" w:cs="Courier New"/>
+          <w:sz w:val="20"/>
+          <w:szCs w:val="20"/>
+        </w:rPr>
+        <w:t xml:space="preserve"> = </w:t>
+      </w:r>
+      <w:proofErr w:type="spellStart"/>
+      <w:r>
+        <w:rPr>
+          <w:rFonts w:ascii="Helvetica" w:hAnsi="Helvetica" w:cs="Courier New"/>
+          <w:sz w:val="20"/>
+          <w:szCs w:val="20"/>
+        </w:rPr>
+        <w:t>RingYear</w:t>
+      </w:r>
+      <w:proofErr w:type="spellEnd"/>
       <w:r>
         <w:rPr>
           <w:rFonts w:ascii="Helvetica" w:hAnsi="Helvetica"/>
@@ -1114,7 +2606,21 @@
         <w:rPr>
           <w:rFonts w:ascii="Helvetica" w:hAnsi="Helvetica"/>
         </w:rPr>
-        <w:t xml:space="preserve"> at least one nest location and a recorded RingColour; this has been used as the example search in the app.</w:t>
+        <w:t xml:space="preserve"> at least one nest location and a recorded </w:t>
+      </w:r>
+      <w:proofErr w:type="spellStart"/>
+      <w:r>
+        <w:rPr>
+          <w:rFonts w:ascii="Helvetica" w:hAnsi="Helvetica"/>
+        </w:rPr>
+        <w:t>RingColour</w:t>
+      </w:r>
+      <w:proofErr w:type="spellEnd"/>
+      <w:r>
+        <w:rPr>
+          <w:rFonts w:ascii="Helvetica" w:hAnsi="Helvetica"/>
+        </w:rPr>
+        <w:t>; this has been used as the example search in the app.</w:t>
       </w:r>
     </w:p>
     <w:p>
@@ -1135,8 +2641,30 @@
         <w:rPr>
           <w:rFonts w:ascii="Helvetica" w:hAnsi="Helvetica"/>
         </w:rPr>
-        <w:t>Think this is a product of not all those individuals in BroodData appearing in IndividualData</w:t>
-      </w:r>
+        <w:t xml:space="preserve">Think this is a product of not all those individuals in </w:t>
+      </w:r>
+      <w:proofErr w:type="spellStart"/>
+      <w:r>
+        <w:rPr>
+          <w:rFonts w:ascii="Helvetica" w:hAnsi="Helvetica"/>
+        </w:rPr>
+        <w:t>BroodData</w:t>
+      </w:r>
+      <w:proofErr w:type="spellEnd"/>
+      <w:r>
+        <w:rPr>
+          <w:rFonts w:ascii="Helvetica" w:hAnsi="Helvetica"/>
+        </w:rPr>
+        <w:t xml:space="preserve"> appearing in </w:t>
+      </w:r>
+      <w:proofErr w:type="spellStart"/>
+      <w:r>
+        <w:rPr>
+          <w:rFonts w:ascii="Helvetica" w:hAnsi="Helvetica"/>
+        </w:rPr>
+        <w:t>IndividualData</w:t>
+      </w:r>
+      <w:proofErr w:type="spellEnd"/>
     </w:p>
     <w:p>
       <w:pPr>
@@ -1334,6 +2862,7 @@
           <w:iCs/>
         </w:rPr>
       </w:pPr>
+      <w:proofErr w:type="spellStart"/>
       <w:r>
         <w:rPr>
           <w:rStyle w:val="Strong"/>
@@ -1345,6 +2874,7 @@
         </w:rPr>
         <w:t>appFormatting_ui.R</w:t>
       </w:r>
+      <w:proofErr w:type="spellEnd"/>
     </w:p>
     <w:p>
       <w:pPr>
@@ -1472,6 +3002,7 @@
           <w:iCs/>
         </w:rPr>
       </w:pPr>
+      <w:proofErr w:type="spellStart"/>
       <w:r>
         <w:rPr>
           <w:rStyle w:val="Strong"/>
@@ -1494,6 +3025,7 @@
         </w:rPr>
         <w:t>.R</w:t>
       </w:r>
+      <w:proofErr w:type="spellEnd"/>
     </w:p>
     <w:p>
       <w:pPr>
@@ -1610,6 +3142,7 @@
           <w:iCs/>
         </w:rPr>
       </w:pPr>
+      <w:proofErr w:type="spellStart"/>
       <w:r>
         <w:rPr>
           <w:rFonts w:ascii="Helvetica" w:hAnsi="Helvetica"/>
@@ -1618,6 +3151,7 @@
         </w:rPr>
         <w:t>birdFinder_module.R</w:t>
       </w:r>
+      <w:proofErr w:type="spellEnd"/>
       <w:r>
         <w:rPr>
           <w:rFonts w:ascii="Helvetica" w:hAnsi="Helvetica"/>
@@ -1625,8 +3159,17 @@
           <w:iCs/>
         </w:rPr>
         <w:br/>
+      </w:r>
+      <w:proofErr w:type="spellStart"/>
+      <w:r>
+        <w:rPr>
+          <w:rFonts w:ascii="Helvetica" w:hAnsi="Helvetica"/>
+          <w:i/>
+          <w:iCs/>
+        </w:rPr>
         <w:t>birdFinder_functions.R</w:t>
       </w:r>
+      <w:proofErr w:type="spellEnd"/>
     </w:p>
     <w:p>
       <w:pPr>
@@ -1649,7 +3192,21 @@
         <w:rPr>
           <w:rFonts w:ascii="Helvetica" w:hAnsi="Helvetica"/>
         </w:rPr>
-        <w:t xml:space="preserve"> a searchable interface for individual birds in the Vlieland dataset</w:t>
+        <w:t xml:space="preserve"> a searchable interface for individual birds in the </w:t>
+      </w:r>
+      <w:proofErr w:type="spellStart"/>
+      <w:r>
+        <w:rPr>
+          <w:rFonts w:ascii="Helvetica" w:hAnsi="Helvetica"/>
+        </w:rPr>
+        <w:t>Vlieland</w:t>
+      </w:r>
+      <w:proofErr w:type="spellEnd"/>
+      <w:r>
+        <w:rPr>
+          <w:rFonts w:ascii="Helvetica" w:hAnsi="Helvetica"/>
+        </w:rPr>
+        <w:t xml:space="preserve"> dataset</w:t>
       </w:r>
     </w:p>
     <w:p>
@@ -1710,19 +3267,30 @@
           <w:i/>
           <w:iCs/>
         </w:rPr>
-        <w:t>Returned reactives</w:t>
-      </w:r>
+        <w:t xml:space="preserve">Returned </w:t>
+      </w:r>
+      <w:proofErr w:type="spellStart"/>
       <w:r>
         <w:rPr>
           <w:rFonts w:ascii="Helvetica" w:hAnsi="Helvetica"/>
           <w:i/>
           <w:iCs/>
         </w:rPr>
+        <w:t>reactives</w:t>
+      </w:r>
+      <w:proofErr w:type="spellEnd"/>
+      <w:r>
+        <w:rPr>
+          <w:rFonts w:ascii="Helvetica" w:hAnsi="Helvetica"/>
+          <w:i/>
+          <w:iCs/>
+        </w:rPr>
         <w:t>:</w:t>
       </w:r>
       <w:r>
         <w:br/>
       </w:r>
+      <w:proofErr w:type="spellStart"/>
       <w:r>
         <w:rPr>
           <w:rStyle w:val="HTMLCode"/>
@@ -1730,9 +3298,11 @@
         </w:rPr>
         <w:t>search_results</w:t>
       </w:r>
+      <w:proofErr w:type="spellEnd"/>
       <w:r>
         <w:br/>
       </w:r>
+      <w:proofErr w:type="spellStart"/>
       <w:r>
         <w:rPr>
           <w:rStyle w:val="HTMLCode"/>
@@ -1740,6 +3310,7 @@
         </w:rPr>
         <w:t>selected_ring</w:t>
       </w:r>
+      <w:proofErr w:type="spellEnd"/>
     </w:p>
     <w:p>
       <w:pPr>
@@ -1784,8 +3355,16 @@
         <w:rPr>
           <w:rFonts w:ascii="Helvetica" w:hAnsi="Helvetica"/>
         </w:rPr>
-        <w:t>This module isn’t fully namespaced</w:t>
-      </w:r>
+        <w:t xml:space="preserve">This module isn’t fully </w:t>
+      </w:r>
+      <w:proofErr w:type="spellStart"/>
+      <w:r>
+        <w:rPr>
+          <w:rFonts w:ascii="Helvetica" w:hAnsi="Helvetica"/>
+        </w:rPr>
+        <w:t>namespaced</w:t>
+      </w:r>
+      <w:proofErr w:type="spellEnd"/>
     </w:p>
     <w:p>
       <w:pPr>
@@ -1834,7 +3413,21 @@
         <w:rPr>
           <w:rFonts w:ascii="Helvetica" w:hAnsi="Helvetica"/>
         </w:rPr>
-        <w:t xml:space="preserve">I didn’t have the full list of colour rings that appears in the IndividualData </w:t>
+        <w:t xml:space="preserve">I didn’t have the full list of colour rings that appears in the </w:t>
+      </w:r>
+      <w:proofErr w:type="spellStart"/>
+      <w:r>
+        <w:rPr>
+          <w:rFonts w:ascii="Helvetica" w:hAnsi="Helvetica"/>
+        </w:rPr>
+        <w:t>IndividualData</w:t>
+      </w:r>
+      <w:proofErr w:type="spellEnd"/>
+      <w:r>
+        <w:rPr>
+          <w:rFonts w:ascii="Helvetica" w:hAnsi="Helvetica"/>
+        </w:rPr>
+        <w:t xml:space="preserve"> </w:t>
       </w:r>
     </w:p>
     <w:p>
@@ -1958,7 +3551,21 @@
           <w:rFonts w:ascii="Helvetica" w:hAnsi="Helvetica"/>
         </w:rPr>
         <w:lastRenderedPageBreak/>
-        <w:t>Only individuals with colour-ring information are searchable in the app (50 individuals in Vlieland dataset).</w:t>
+        <w:t xml:space="preserve">Only individuals with colour-ring information are searchable in the app (50 individuals in </w:t>
+      </w:r>
+      <w:proofErr w:type="spellStart"/>
+      <w:r>
+        <w:rPr>
+          <w:rFonts w:ascii="Helvetica" w:hAnsi="Helvetica"/>
+        </w:rPr>
+        <w:t>Vlieland</w:t>
+      </w:r>
+      <w:proofErr w:type="spellEnd"/>
+      <w:r>
+        <w:rPr>
+          <w:rFonts w:ascii="Helvetica" w:hAnsi="Helvetica"/>
+        </w:rPr>
+        <w:t xml:space="preserve"> dataset).</w:t>
       </w:r>
     </w:p>
     <w:p>
@@ -1979,17 +3586,33 @@
         </w:rPr>
         <w:t xml:space="preserve">Not all individuals in </w:t>
       </w:r>
+      <w:proofErr w:type="spellStart"/>
       <w:r>
         <w:rPr>
           <w:rFonts w:ascii="Helvetica" w:hAnsi="Helvetica"/>
         </w:rPr>
         <w:t>BroodData</w:t>
       </w:r>
-      <w:r>
-        <w:rPr>
-          <w:rFonts w:ascii="Helvetica" w:hAnsi="Helvetica"/>
-        </w:rPr>
-        <w:t xml:space="preserve"> appear in IndividualDataVlieland and vice versa so there is lots of incomplete data (missing locations, brood events, offspring)</w:t>
+      <w:proofErr w:type="spellEnd"/>
+      <w:r>
+        <w:rPr>
+          <w:rFonts w:ascii="Helvetica" w:hAnsi="Helvetica"/>
+        </w:rPr>
+        <w:t xml:space="preserve"> appear in </w:t>
+      </w:r>
+      <w:proofErr w:type="spellStart"/>
+      <w:r>
+        <w:rPr>
+          <w:rFonts w:ascii="Helvetica" w:hAnsi="Helvetica"/>
+        </w:rPr>
+        <w:t>IndividualDataVlieland</w:t>
+      </w:r>
+      <w:proofErr w:type="spellEnd"/>
+      <w:r>
+        <w:rPr>
+          <w:rFonts w:ascii="Helvetica" w:hAnsi="Helvetica"/>
+        </w:rPr>
+        <w:t xml:space="preserve"> and vice versa so there is lots of incomplete data (missing locations, brood events, offspring)</w:t>
       </w:r>
     </w:p>
     <w:p/>
@@ -2034,6 +3657,7 @@
           <w:iCs/>
         </w:rPr>
       </w:pPr>
+      <w:proofErr w:type="spellStart"/>
       <w:r>
         <w:rPr>
           <w:rFonts w:ascii="Helvetica" w:hAnsi="Helvetica"/>
@@ -2042,6 +3666,7 @@
         </w:rPr>
         <w:t>mappingInd_module.R</w:t>
       </w:r>
+      <w:proofErr w:type="spellEnd"/>
     </w:p>
     <w:p>
       <w:pPr>
@@ -2051,6 +3676,7 @@
           <w:iCs/>
         </w:rPr>
       </w:pPr>
+      <w:proofErr w:type="spellStart"/>
       <w:r>
         <w:rPr>
           <w:rFonts w:ascii="Helvetica" w:hAnsi="Helvetica"/>
@@ -2059,6 +3685,7 @@
         </w:rPr>
         <w:t>mappingPreview_functions.R</w:t>
       </w:r>
+      <w:proofErr w:type="spellEnd"/>
     </w:p>
     <w:p>
       <w:pPr>
@@ -2098,12 +3725,14 @@
         </w:rPr>
         <w:t xml:space="preserve"> showing the last known location of a bird selected from the search results in the </w:t>
       </w:r>
+      <w:proofErr w:type="spellStart"/>
       <w:r>
         <w:rPr>
           <w:rFonts w:ascii="Helvetica" w:eastAsiaTheme="majorEastAsia" w:hAnsi="Helvetica"/>
         </w:rPr>
         <w:t>birdFinder</w:t>
       </w:r>
+      <w:proofErr w:type="spellEnd"/>
       <w:r>
         <w:rPr>
           <w:rFonts w:ascii="Helvetica" w:hAnsi="Helvetica"/>
@@ -2153,12 +3782,14 @@
           <w:rFonts w:ascii="Helvetica" w:hAnsi="Helvetica"/>
         </w:rPr>
       </w:pPr>
+      <w:proofErr w:type="spellStart"/>
       <w:r>
         <w:rPr>
           <w:rFonts w:ascii="Helvetica" w:eastAsiaTheme="majorEastAsia" w:hAnsi="Helvetica"/>
         </w:rPr>
         <w:t>search_results</w:t>
       </w:r>
+      <w:proofErr w:type="spellEnd"/>
       <w:r>
         <w:rPr>
           <w:rFonts w:ascii="Helvetica" w:hAnsi="Helvetica"/>
@@ -2176,24 +3807,42 @@
           <w:rFonts w:ascii="Helvetica" w:hAnsi="Helvetica"/>
         </w:rPr>
       </w:pPr>
+      <w:proofErr w:type="spellStart"/>
       <w:r>
         <w:rPr>
           <w:rFonts w:ascii="Helvetica" w:eastAsiaTheme="majorEastAsia" w:hAnsi="Helvetica"/>
         </w:rPr>
         <w:t>location.data</w:t>
       </w:r>
-      <w:r>
-        <w:rPr>
-          <w:rFonts w:ascii="Helvetica" w:hAnsi="Helvetica"/>
-        </w:rPr>
-        <w:t xml:space="preserve">: dataframe with bird location records, including </w:t>
-      </w:r>
+      <w:proofErr w:type="spellEnd"/>
+      <w:r>
+        <w:rPr>
+          <w:rFonts w:ascii="Helvetica" w:hAnsi="Helvetica"/>
+        </w:rPr>
+        <w:t xml:space="preserve">: </w:t>
+      </w:r>
+      <w:proofErr w:type="spellStart"/>
+      <w:r>
+        <w:rPr>
+          <w:rFonts w:ascii="Helvetica" w:hAnsi="Helvetica"/>
+        </w:rPr>
+        <w:t>dataframe</w:t>
+      </w:r>
+      <w:proofErr w:type="spellEnd"/>
+      <w:r>
+        <w:rPr>
+          <w:rFonts w:ascii="Helvetica" w:hAnsi="Helvetica"/>
+        </w:rPr>
+        <w:t xml:space="preserve"> with bird location records, including </w:t>
+      </w:r>
+      <w:proofErr w:type="spellStart"/>
       <w:r>
         <w:rPr>
           <w:rFonts w:ascii="Helvetica" w:eastAsiaTheme="majorEastAsia" w:hAnsi="Helvetica"/>
         </w:rPr>
         <w:t>RingNumber</w:t>
       </w:r>
+      <w:proofErr w:type="spellEnd"/>
       <w:r>
         <w:rPr>
           <w:rFonts w:ascii="Helvetica" w:hAnsi="Helvetica"/>
@@ -2236,24 +3885,28 @@
         </w:rPr>
         <w:t xml:space="preserve">, </w:t>
       </w:r>
+      <w:proofErr w:type="spellStart"/>
       <w:r>
         <w:rPr>
           <w:rFonts w:ascii="Helvetica" w:eastAsiaTheme="majorEastAsia" w:hAnsi="Helvetica"/>
         </w:rPr>
         <w:t>NestLon</w:t>
       </w:r>
+      <w:proofErr w:type="spellEnd"/>
       <w:r>
         <w:rPr>
           <w:rFonts w:ascii="Helvetica" w:hAnsi="Helvetica"/>
         </w:rPr>
         <w:t xml:space="preserve">, and </w:t>
       </w:r>
+      <w:proofErr w:type="spellStart"/>
       <w:r>
         <w:rPr>
           <w:rFonts w:ascii="Helvetica" w:eastAsiaTheme="majorEastAsia" w:hAnsi="Helvetica"/>
         </w:rPr>
         <w:t>NestLat</w:t>
       </w:r>
+      <w:proofErr w:type="spellEnd"/>
       <w:r>
         <w:rPr>
           <w:rFonts w:ascii="Helvetica" w:hAnsi="Helvetica"/>
@@ -2294,8 +3947,16 @@
         <w:rPr>
           <w:rFonts w:ascii="Helvetica" w:hAnsi="Helvetica"/>
         </w:rPr>
-        <w:t>This module isn’t fully namespaced</w:t>
-      </w:r>
+        <w:t xml:space="preserve">This module isn’t fully </w:t>
+      </w:r>
+      <w:proofErr w:type="spellStart"/>
+      <w:r>
+        <w:rPr>
+          <w:rFonts w:ascii="Helvetica" w:hAnsi="Helvetica"/>
+        </w:rPr>
+        <w:t>namespaced</w:t>
+      </w:r>
+      <w:proofErr w:type="spellEnd"/>
     </w:p>
     <w:p>
       <w:pPr>
@@ -2332,6 +3993,7 @@
           <w:iCs/>
         </w:rPr>
       </w:pPr>
+      <w:proofErr w:type="spellStart"/>
       <w:r>
         <w:rPr>
           <w:rFonts w:ascii="Helvetica" w:hAnsi="Helvetica"/>
@@ -2340,6 +4002,7 @@
         </w:rPr>
         <w:t>individualInfo_module.R</w:t>
       </w:r>
+      <w:proofErr w:type="spellEnd"/>
       <w:r>
         <w:rPr>
           <w:rFonts w:ascii="Helvetica" w:hAnsi="Helvetica"/>
@@ -2348,6 +4011,7 @@
         </w:rPr>
         <w:br/>
       </w:r>
+      <w:proofErr w:type="spellStart"/>
       <w:r>
         <w:rPr>
           <w:rFonts w:ascii="Helvetica" w:hAnsi="Helvetica"/>
@@ -2356,6 +4020,7 @@
         </w:rPr>
         <w:t>individualInfo_functions.R</w:t>
       </w:r>
+      <w:proofErr w:type="spellEnd"/>
     </w:p>
     <w:p>
       <w:pPr>
@@ -2416,11 +4081,33 @@
           <w:rFonts w:ascii="Helvetica" w:hAnsi="Helvetica"/>
         </w:rPr>
       </w:pPr>
-      <w:r>
-        <w:rPr>
-          <w:rFonts w:ascii="Helvetica" w:hAnsi="Helvetica"/>
-        </w:rPr>
-        <w:t>vlieland.data: Dataframe containing individual bird data</w:t>
+      <w:proofErr w:type="spellStart"/>
+      <w:r>
+        <w:rPr>
+          <w:rFonts w:ascii="Helvetica" w:hAnsi="Helvetica"/>
+        </w:rPr>
+        <w:t>vlieland.data</w:t>
+      </w:r>
+      <w:proofErr w:type="spellEnd"/>
+      <w:r>
+        <w:rPr>
+          <w:rFonts w:ascii="Helvetica" w:hAnsi="Helvetica"/>
+        </w:rPr>
+        <w:t xml:space="preserve">: </w:t>
+      </w:r>
+      <w:proofErr w:type="spellStart"/>
+      <w:r>
+        <w:rPr>
+          <w:rFonts w:ascii="Helvetica" w:hAnsi="Helvetica"/>
+        </w:rPr>
+        <w:t>Dataframe</w:t>
+      </w:r>
+      <w:proofErr w:type="spellEnd"/>
+      <w:r>
+        <w:rPr>
+          <w:rFonts w:ascii="Helvetica" w:hAnsi="Helvetica"/>
+        </w:rPr>
+        <w:t xml:space="preserve"> containing individual bird data</w:t>
       </w:r>
     </w:p>
     <w:p>
@@ -2434,12 +4121,28 @@
           <w:rFonts w:ascii="Helvetica" w:hAnsi="Helvetica"/>
         </w:rPr>
       </w:pPr>
-      <w:r>
-        <w:rPr>
-          <w:rFonts w:ascii="Helvetica" w:hAnsi="Helvetica"/>
-        </w:rPr>
-        <w:t>selected_ring: Reactive value for currently selected bird RingNumber</w:t>
-      </w:r>
+      <w:proofErr w:type="spellStart"/>
+      <w:r>
+        <w:rPr>
+          <w:rFonts w:ascii="Helvetica" w:hAnsi="Helvetica"/>
+        </w:rPr>
+        <w:t>selected_ring</w:t>
+      </w:r>
+      <w:proofErr w:type="spellEnd"/>
+      <w:r>
+        <w:rPr>
+          <w:rFonts w:ascii="Helvetica" w:hAnsi="Helvetica"/>
+        </w:rPr>
+        <w:t xml:space="preserve">: Reactive value for currently selected bird </w:t>
+      </w:r>
+      <w:proofErr w:type="spellStart"/>
+      <w:r>
+        <w:rPr>
+          <w:rFonts w:ascii="Helvetica" w:hAnsi="Helvetica"/>
+        </w:rPr>
+        <w:t>RingNumber</w:t>
+      </w:r>
+      <w:proofErr w:type="spellEnd"/>
     </w:p>
     <w:p>
       <w:pPr>
@@ -2486,6 +4189,7 @@
           <w:iCs/>
         </w:rPr>
       </w:pPr>
+      <w:proofErr w:type="spellStart"/>
       <w:r>
         <w:rPr>
           <w:rFonts w:ascii="Helvetica" w:hAnsi="Helvetica"/>
@@ -2494,6 +4198,7 @@
         </w:rPr>
         <w:t>mappingInd_module.R</w:t>
       </w:r>
+      <w:proofErr w:type="spellEnd"/>
       <w:r>
         <w:rPr>
           <w:rFonts w:ascii="Helvetica" w:hAnsi="Helvetica"/>
@@ -2501,8 +4206,17 @@
           <w:iCs/>
         </w:rPr>
         <w:br/>
+      </w:r>
+      <w:proofErr w:type="spellStart"/>
+      <w:r>
+        <w:rPr>
+          <w:rFonts w:ascii="Helvetica" w:hAnsi="Helvetica"/>
+          <w:i/>
+          <w:iCs/>
+        </w:rPr>
         <w:t>mappingInd_functions.R</w:t>
       </w:r>
+      <w:proofErr w:type="spellEnd"/>
     </w:p>
     <w:p>
       <w:pPr>
@@ -2578,11 +4292,75 @@
           <w:iCs/>
         </w:rPr>
       </w:pPr>
-      <w:r>
-        <w:rPr>
-          <w:rFonts w:ascii="Helvetica" w:hAnsi="Helvetica"/>
-        </w:rPr>
-        <w:t>location.data: Dataframe with bird locations (RingNumber, Event, Year, Month, NestLon, NestLat, etc.)</w:t>
+      <w:proofErr w:type="spellStart"/>
+      <w:r>
+        <w:rPr>
+          <w:rFonts w:ascii="Helvetica" w:hAnsi="Helvetica"/>
+        </w:rPr>
+        <w:t>location.data</w:t>
+      </w:r>
+      <w:proofErr w:type="spellEnd"/>
+      <w:r>
+        <w:rPr>
+          <w:rFonts w:ascii="Helvetica" w:hAnsi="Helvetica"/>
+        </w:rPr>
+        <w:t xml:space="preserve">: </w:t>
+      </w:r>
+      <w:proofErr w:type="spellStart"/>
+      <w:r>
+        <w:rPr>
+          <w:rFonts w:ascii="Helvetica" w:hAnsi="Helvetica"/>
+        </w:rPr>
+        <w:t>Dataframe</w:t>
+      </w:r>
+      <w:proofErr w:type="spellEnd"/>
+      <w:r>
+        <w:rPr>
+          <w:rFonts w:ascii="Helvetica" w:hAnsi="Helvetica"/>
+        </w:rPr>
+        <w:t xml:space="preserve"> with bird locations (</w:t>
+      </w:r>
+      <w:proofErr w:type="spellStart"/>
+      <w:r>
+        <w:rPr>
+          <w:rFonts w:ascii="Helvetica" w:hAnsi="Helvetica"/>
+        </w:rPr>
+        <w:t>RingNumber</w:t>
+      </w:r>
+      <w:proofErr w:type="spellEnd"/>
+      <w:r>
+        <w:rPr>
+          <w:rFonts w:ascii="Helvetica" w:hAnsi="Helvetica"/>
+        </w:rPr>
+        <w:t xml:space="preserve">, Event, Year, Month, </w:t>
+      </w:r>
+      <w:proofErr w:type="spellStart"/>
+      <w:r>
+        <w:rPr>
+          <w:rFonts w:ascii="Helvetica" w:hAnsi="Helvetica"/>
+        </w:rPr>
+        <w:t>NestLon</w:t>
+      </w:r>
+      <w:proofErr w:type="spellEnd"/>
+      <w:r>
+        <w:rPr>
+          <w:rFonts w:ascii="Helvetica" w:hAnsi="Helvetica"/>
+        </w:rPr>
+        <w:t xml:space="preserve">, </w:t>
+      </w:r>
+      <w:proofErr w:type="spellStart"/>
+      <w:r>
+        <w:rPr>
+          <w:rFonts w:ascii="Helvetica" w:hAnsi="Helvetica"/>
+        </w:rPr>
+        <w:t>NestLat</w:t>
+      </w:r>
+      <w:proofErr w:type="spellEnd"/>
+      <w:r>
+        <w:rPr>
+          <w:rFonts w:ascii="Helvetica" w:hAnsi="Helvetica"/>
+        </w:rPr>
+        <w:t>, etc.)</w:t>
       </w:r>
     </w:p>
     <w:p>
@@ -2598,12 +4376,28 @@
           <w:iCs/>
         </w:rPr>
       </w:pPr>
-      <w:r>
-        <w:rPr>
-          <w:rFonts w:ascii="Helvetica" w:hAnsi="Helvetica"/>
-        </w:rPr>
-        <w:t>selected_ring: Reactive value of currently selected bird RingNumber</w:t>
-      </w:r>
+      <w:proofErr w:type="spellStart"/>
+      <w:r>
+        <w:rPr>
+          <w:rFonts w:ascii="Helvetica" w:hAnsi="Helvetica"/>
+        </w:rPr>
+        <w:t>selected_ring</w:t>
+      </w:r>
+      <w:proofErr w:type="spellEnd"/>
+      <w:r>
+        <w:rPr>
+          <w:rFonts w:ascii="Helvetica" w:hAnsi="Helvetica"/>
+        </w:rPr>
+        <w:t xml:space="preserve">: Reactive value of currently selected bird </w:t>
+      </w:r>
+      <w:proofErr w:type="spellStart"/>
+      <w:r>
+        <w:rPr>
+          <w:rFonts w:ascii="Helvetica" w:hAnsi="Helvetica"/>
+        </w:rPr>
+        <w:t>RingNumber</w:t>
+      </w:r>
+      <w:proofErr w:type="spellEnd"/>
     </w:p>
     <w:p>
       <w:pPr>
@@ -2696,7 +4490,21 @@
         <w:rPr>
           <w:rFonts w:ascii="Helvetica" w:hAnsi="Helvetica"/>
         </w:rPr>
-        <w:t xml:space="preserve"> at least one nest location and a recorded RingColour; this has been used as the example search in the app.</w:t>
+        <w:t xml:space="preserve"> at least one nest location and a recorded </w:t>
+      </w:r>
+      <w:proofErr w:type="spellStart"/>
+      <w:r>
+        <w:rPr>
+          <w:rFonts w:ascii="Helvetica" w:hAnsi="Helvetica"/>
+        </w:rPr>
+        <w:t>RingColour</w:t>
+      </w:r>
+      <w:proofErr w:type="spellEnd"/>
+      <w:r>
+        <w:rPr>
+          <w:rFonts w:ascii="Helvetica" w:hAnsi="Helvetica"/>
+        </w:rPr>
+        <w:t>; this has been used as the example search in the app.</w:t>
       </w:r>
     </w:p>
     <w:p>
@@ -2714,8 +4522,30 @@
         <w:rPr>
           <w:rFonts w:ascii="Helvetica" w:hAnsi="Helvetica"/>
         </w:rPr>
-        <w:t>Think this is a product of not all those individuals in BroodData appearing in IndividualData</w:t>
-      </w:r>
+        <w:t xml:space="preserve">Think this is a product of not all those individuals in </w:t>
+      </w:r>
+      <w:proofErr w:type="spellStart"/>
+      <w:r>
+        <w:rPr>
+          <w:rFonts w:ascii="Helvetica" w:hAnsi="Helvetica"/>
+        </w:rPr>
+        <w:t>BroodData</w:t>
+      </w:r>
+      <w:proofErr w:type="spellEnd"/>
+      <w:r>
+        <w:rPr>
+          <w:rFonts w:ascii="Helvetica" w:hAnsi="Helvetica"/>
+        </w:rPr>
+        <w:t xml:space="preserve"> appearing in </w:t>
+      </w:r>
+      <w:proofErr w:type="spellStart"/>
+      <w:r>
+        <w:rPr>
+          <w:rFonts w:ascii="Helvetica" w:hAnsi="Helvetica"/>
+        </w:rPr>
+        <w:t>IndividualData</w:t>
+      </w:r>
+      <w:proofErr w:type="spellEnd"/>
     </w:p>
     <w:p>
       <w:pPr>
@@ -2760,6 +4590,7 @@
           <w:iCs/>
         </w:rPr>
       </w:pPr>
+      <w:proofErr w:type="spellStart"/>
       <w:r>
         <w:rPr>
           <w:rFonts w:ascii="Helvetica" w:hAnsi="Helvetica"/>
@@ -2768,6 +4599,7 @@
         </w:rPr>
         <w:t>family_tree_module.R</w:t>
       </w:r>
+      <w:proofErr w:type="spellEnd"/>
       <w:r>
         <w:rPr>
           <w:rFonts w:ascii="Helvetica" w:hAnsi="Helvetica"/>
@@ -2775,8 +4607,17 @@
           <w:iCs/>
         </w:rPr>
         <w:br/>
+      </w:r>
+      <w:proofErr w:type="spellStart"/>
+      <w:r>
+        <w:rPr>
+          <w:rFonts w:ascii="Helvetica" w:hAnsi="Helvetica"/>
+          <w:i/>
+          <w:iCs/>
+        </w:rPr>
         <w:t>family_tree_functions.R</w:t>
       </w:r>
+      <w:proofErr w:type="spellEnd"/>
     </w:p>
     <w:p>
       <w:pPr>
@@ -2869,11 +4710,61 @@
           <w:rFonts w:ascii="Helvetica" w:hAnsi="Helvetica"/>
         </w:rPr>
       </w:pPr>
-      <w:r>
-        <w:rPr>
-          <w:rFonts w:ascii="Helvetica" w:hAnsi="Helvetica"/>
-        </w:rPr>
-        <w:t>ped.data: Dataframe containing bird pedigree (RingNumber, Mother, Father, BroodID, Sex, etc.)</w:t>
+      <w:proofErr w:type="spellStart"/>
+      <w:r>
+        <w:rPr>
+          <w:rFonts w:ascii="Helvetica" w:hAnsi="Helvetica"/>
+        </w:rPr>
+        <w:t>ped.data</w:t>
+      </w:r>
+      <w:proofErr w:type="spellEnd"/>
+      <w:r>
+        <w:rPr>
+          <w:rFonts w:ascii="Helvetica" w:hAnsi="Helvetica"/>
+        </w:rPr>
+        <w:t xml:space="preserve">: </w:t>
+      </w:r>
+      <w:proofErr w:type="spellStart"/>
+      <w:r>
+        <w:rPr>
+          <w:rFonts w:ascii="Helvetica" w:hAnsi="Helvetica"/>
+        </w:rPr>
+        <w:t>Dataframe</w:t>
+      </w:r>
+      <w:proofErr w:type="spellEnd"/>
+      <w:r>
+        <w:rPr>
+          <w:rFonts w:ascii="Helvetica" w:hAnsi="Helvetica"/>
+        </w:rPr>
+        <w:t xml:space="preserve"> containing bird pedigree (</w:t>
+      </w:r>
+      <w:proofErr w:type="spellStart"/>
+      <w:r>
+        <w:rPr>
+          <w:rFonts w:ascii="Helvetica" w:hAnsi="Helvetica"/>
+        </w:rPr>
+        <w:t>RingNumber</w:t>
+      </w:r>
+      <w:proofErr w:type="spellEnd"/>
+      <w:r>
+        <w:rPr>
+          <w:rFonts w:ascii="Helvetica" w:hAnsi="Helvetica"/>
+        </w:rPr>
+        <w:t xml:space="preserve">, Mother, Father, </w:t>
+      </w:r>
+      <w:proofErr w:type="spellStart"/>
+      <w:r>
+        <w:rPr>
+          <w:rFonts w:ascii="Helvetica" w:hAnsi="Helvetica"/>
+        </w:rPr>
+        <w:t>BroodID</w:t>
+      </w:r>
+      <w:proofErr w:type="spellEnd"/>
+      <w:r>
+        <w:rPr>
+          <w:rFonts w:ascii="Helvetica" w:hAnsi="Helvetica"/>
+        </w:rPr>
+        <w:t>, Sex, etc.)</w:t>
       </w:r>
     </w:p>
     <w:p>
@@ -2887,11 +4778,33 @@
           <w:rFonts w:ascii="Helvetica" w:hAnsi="Helvetica"/>
         </w:rPr>
       </w:pPr>
-      <w:r>
-        <w:rPr>
-          <w:rFonts w:ascii="Helvetica" w:hAnsi="Helvetica"/>
-        </w:rPr>
-        <w:t>brood.data: Dataframe with breeding records, used to identify recruits</w:t>
+      <w:proofErr w:type="spellStart"/>
+      <w:r>
+        <w:rPr>
+          <w:rFonts w:ascii="Helvetica" w:hAnsi="Helvetica"/>
+        </w:rPr>
+        <w:t>brood.data</w:t>
+      </w:r>
+      <w:proofErr w:type="spellEnd"/>
+      <w:r>
+        <w:rPr>
+          <w:rFonts w:ascii="Helvetica" w:hAnsi="Helvetica"/>
+        </w:rPr>
+        <w:t xml:space="preserve">: </w:t>
+      </w:r>
+      <w:proofErr w:type="spellStart"/>
+      <w:r>
+        <w:rPr>
+          <w:rFonts w:ascii="Helvetica" w:hAnsi="Helvetica"/>
+        </w:rPr>
+        <w:t>Dataframe</w:t>
+      </w:r>
+      <w:proofErr w:type="spellEnd"/>
+      <w:r>
+        <w:rPr>
+          <w:rFonts w:ascii="Helvetica" w:hAnsi="Helvetica"/>
+        </w:rPr>
+        <w:t xml:space="preserve"> with breeding records, used to identify recruits</w:t>
       </w:r>
     </w:p>
     <w:p>
@@ -2905,12 +4818,28 @@
           <w:rFonts w:ascii="Helvetica" w:hAnsi="Helvetica"/>
         </w:rPr>
       </w:pPr>
-      <w:r>
-        <w:rPr>
-          <w:rFonts w:ascii="Helvetica" w:hAnsi="Helvetica"/>
-        </w:rPr>
-        <w:t>selected_ring: Reactive value of currently selected bird RingNumber</w:t>
-      </w:r>
+      <w:proofErr w:type="spellStart"/>
+      <w:r>
+        <w:rPr>
+          <w:rFonts w:ascii="Helvetica" w:hAnsi="Helvetica"/>
+        </w:rPr>
+        <w:t>selected_ring</w:t>
+      </w:r>
+      <w:proofErr w:type="spellEnd"/>
+      <w:r>
+        <w:rPr>
+          <w:rFonts w:ascii="Helvetica" w:hAnsi="Helvetica"/>
+        </w:rPr>
+        <w:t xml:space="preserve">: Reactive value of currently selected bird </w:t>
+      </w:r>
+      <w:proofErr w:type="spellStart"/>
+      <w:r>
+        <w:rPr>
+          <w:rFonts w:ascii="Helvetica" w:hAnsi="Helvetica"/>
+        </w:rPr>
+        <w:t>RingNumber</w:t>
+      </w:r>
+      <w:proofErr w:type="spellEnd"/>
     </w:p>
     <w:p>
       <w:pPr>
@@ -2999,8 +4928,16 @@
         <w:rPr>
           <w:rFonts w:ascii="Helvetica" w:hAnsi="Helvetica"/>
         </w:rPr>
-        <w:t>Apparently, this is a known issue with shapes that aren’t circles/squares and plotly</w:t>
-      </w:r>
+        <w:t xml:space="preserve">Apparently, this is a known issue with shapes that aren’t circles/squares and </w:t>
+      </w:r>
+      <w:proofErr w:type="spellStart"/>
+      <w:r>
+        <w:rPr>
+          <w:rFonts w:ascii="Helvetica" w:hAnsi="Helvetica"/>
+        </w:rPr>
+        <w:t>plotly</w:t>
+      </w:r>
+      <w:proofErr w:type="spellEnd"/>
     </w:p>
     <w:p>
       <w:pPr>
@@ -3064,6 +5001,7 @@
         </w:rPr>
         <w:t xml:space="preserve">Determined as birds appearing as a mother or father in </w:t>
       </w:r>
+      <w:proofErr w:type="spellStart"/>
       <w:r>
         <w:rPr>
           <w:rFonts w:ascii="Helvetica" w:hAnsi="Helvetica" w:cs="Courier New"/>
@@ -3072,12 +5010,14 @@
         </w:rPr>
         <w:t>IndividualData</w:t>
       </w:r>
+      <w:proofErr w:type="spellEnd"/>
       <w:r>
         <w:rPr>
           <w:rFonts w:ascii="Helvetica" w:hAnsi="Helvetica"/>
         </w:rPr>
         <w:t xml:space="preserve">, or as female/male in </w:t>
       </w:r>
+      <w:proofErr w:type="spellStart"/>
       <w:r>
         <w:rPr>
           <w:rFonts w:ascii="Helvetica" w:hAnsi="Helvetica" w:cs="Courier New"/>
@@ -3086,6 +5026,7 @@
         </w:rPr>
         <w:t>BroodData</w:t>
       </w:r>
+      <w:proofErr w:type="spellEnd"/>
       <w:r>
         <w:rPr>
           <w:rFonts w:ascii="Helvetica" w:hAnsi="Helvetica"/>
@@ -3111,6 +5052,8 @@
         </w:rPr>
         <w:t xml:space="preserve">Some recruits appear in </w:t>
       </w:r>
+      <w:proofErr w:type="spellStart"/>
+      <w:proofErr w:type="gramStart"/>
       <w:r>
         <w:rPr>
           <w:rFonts w:ascii="Helvetica" w:hAnsi="Helvetica" w:cs="Courier New"/>
@@ -3119,12 +5062,15 @@
         </w:rPr>
         <w:t>BroodData</w:t>
       </w:r>
+      <w:proofErr w:type="spellEnd"/>
+      <w:proofErr w:type="gramEnd"/>
       <w:r>
         <w:rPr>
           <w:rFonts w:ascii="Helvetica" w:hAnsi="Helvetica"/>
         </w:rPr>
         <w:t xml:space="preserve"> but their </w:t>
       </w:r>
+      <w:proofErr w:type="spellStart"/>
       <w:r>
         <w:rPr>
           <w:rFonts w:ascii="Helvetica" w:hAnsi="Helvetica" w:cs="Courier New"/>
@@ -3133,12 +5079,14 @@
         </w:rPr>
         <w:t>BroodID</w:t>
       </w:r>
+      <w:proofErr w:type="spellEnd"/>
       <w:r>
         <w:rPr>
           <w:rFonts w:ascii="Helvetica" w:hAnsi="Helvetica"/>
         </w:rPr>
         <w:t xml:space="preserve"> does not exist in </w:t>
       </w:r>
+      <w:proofErr w:type="spellStart"/>
       <w:r>
         <w:rPr>
           <w:rFonts w:ascii="Helvetica" w:hAnsi="Helvetica" w:cs="Courier New"/>
@@ -3147,6 +5095,7 @@
         </w:rPr>
         <w:t>IndividualData</w:t>
       </w:r>
+      <w:proofErr w:type="spellEnd"/>
       <w:r>
         <w:rPr>
           <w:rFonts w:ascii="Helvetica" w:hAnsi="Helvetica"/>
@@ -3215,6 +5164,7 @@
         </w:rPr>
         <w:t xml:space="preserve"> can be modified in </w:t>
       </w:r>
+      <w:proofErr w:type="spellStart"/>
       <w:r>
         <w:rPr>
           <w:rFonts w:ascii="Helvetica" w:hAnsi="Helvetica" w:cs="Courier New"/>
@@ -3239,19 +5189,30 @@
         </w:rPr>
         <w:t>R</w:t>
       </w:r>
+      <w:proofErr w:type="spellEnd"/>
       <w:r>
         <w:rPr>
           <w:rFonts w:ascii="Helvetica" w:hAnsi="Helvetica"/>
         </w:rPr>
         <w:t xml:space="preserve"> in the </w:t>
       </w:r>
+      <w:proofErr w:type="spellStart"/>
       <w:r>
         <w:rPr>
           <w:rFonts w:ascii="Helvetica" w:hAnsi="Helvetica" w:cs="Courier New"/>
           <w:sz w:val="20"/>
           <w:szCs w:val="20"/>
         </w:rPr>
-        <w:t>get_family_subset()</w:t>
+        <w:t>get_family_subset</w:t>
+      </w:r>
+      <w:proofErr w:type="spellEnd"/>
+      <w:r>
+        <w:rPr>
+          <w:rFonts w:ascii="Helvetica" w:hAnsi="Helvetica" w:cs="Courier New"/>
+          <w:sz w:val="20"/>
+          <w:szCs w:val="20"/>
+        </w:rPr>
+        <w:t>()</w:t>
       </w:r>
       <w:r>
         <w:rPr>
@@ -3260,9 +5221,74 @@
         <w:t xml:space="preserve"> function.</w:t>
       </w:r>
     </w:p>
-    <w:p>
-      <w:pPr>
-        <w:pStyle w:val="ListParagraph"/>
+    <w:p/>
+    <w:p>
+      <w:pPr>
+        <w:pStyle w:val="NormalWeb"/>
+        <w:rPr>
+          <w:rFonts w:ascii="Helvetica" w:hAnsi="Helvetica"/>
+          <w:b/>
+          <w:bCs/>
+        </w:rPr>
+      </w:pPr>
+      <w:r>
+        <w:rPr>
+          <w:rFonts w:ascii="Helvetica" w:hAnsi="Helvetica"/>
+          <w:b/>
+          <w:bCs/>
+        </w:rPr>
+        <w:t>Population tends</w:t>
+      </w:r>
+      <w:r>
+        <w:rPr>
+          <w:rFonts w:ascii="Helvetica" w:hAnsi="Helvetica"/>
+          <w:b/>
+          <w:bCs/>
+        </w:rPr>
+        <w:t xml:space="preserve"> module</w:t>
+      </w:r>
+    </w:p>
+    <w:p>
+      <w:pPr>
+        <w:pStyle w:val="NormalWeb"/>
+        <w:rPr>
+          <w:rFonts w:ascii="Helvetica" w:hAnsi="Helvetica"/>
+          <w:i/>
+          <w:iCs/>
+        </w:rPr>
+      </w:pPr>
+      <w:proofErr w:type="spellStart"/>
+      <w:r>
+        <w:rPr>
+          <w:rFonts w:ascii="Helvetica" w:hAnsi="Helvetica"/>
+          <w:i/>
+          <w:iCs/>
+        </w:rPr>
+        <w:t>populationTrends_module.R</w:t>
+      </w:r>
+      <w:proofErr w:type="spellEnd"/>
+      <w:r>
+        <w:rPr>
+          <w:rFonts w:ascii="Helvetica" w:hAnsi="Helvetica"/>
+          <w:i/>
+          <w:iCs/>
+        </w:rPr>
+        <w:br/>
+      </w:r>
+      <w:proofErr w:type="spellStart"/>
+      <w:r>
+        <w:rPr>
+          <w:rFonts w:ascii="Helvetica" w:hAnsi="Helvetica"/>
+          <w:i/>
+          <w:iCs/>
+        </w:rPr>
+        <w:t>populationTrends_functions.R</w:t>
+      </w:r>
+      <w:proofErr w:type="spellEnd"/>
+    </w:p>
+    <w:p>
+      <w:pPr>
+        <w:pStyle w:val="NormalWeb"/>
         <w:numPr>
           <w:ilvl w:val="0"/>
           <w:numId w:val="1"/>
@@ -3271,59 +5297,17 @@
           <w:rFonts w:ascii="Helvetica" w:hAnsi="Helvetica"/>
         </w:rPr>
       </w:pPr>
-    </w:p>
-    <w:p/>
-    <w:p>
-      <w:pPr>
-        <w:pStyle w:val="NormalWeb"/>
-        <w:rPr>
-          <w:rFonts w:ascii="Helvetica" w:hAnsi="Helvetica"/>
-          <w:b/>
-          <w:bCs/>
-        </w:rPr>
-      </w:pPr>
-      <w:r>
-        <w:rPr>
-          <w:rFonts w:ascii="Helvetica" w:hAnsi="Helvetica"/>
-          <w:b/>
-          <w:bCs/>
-        </w:rPr>
-        <w:t>Population tends</w:t>
-      </w:r>
-      <w:r>
-        <w:rPr>
-          <w:rFonts w:ascii="Helvetica" w:hAnsi="Helvetica"/>
-          <w:b/>
-          <w:bCs/>
-        </w:rPr>
-        <w:t xml:space="preserve"> module</w:t>
-      </w:r>
-    </w:p>
-    <w:p>
-      <w:pPr>
-        <w:pStyle w:val="NormalWeb"/>
-        <w:rPr>
-          <w:rFonts w:ascii="Helvetica" w:hAnsi="Helvetica"/>
-          <w:i/>
-          <w:iCs/>
-        </w:rPr>
-      </w:pPr>
-      <w:r>
-        <w:rPr>
-          <w:rFonts w:ascii="Helvetica" w:hAnsi="Helvetica"/>
-          <w:i/>
-          <w:iCs/>
-        </w:rPr>
-        <w:t>populationTrends_module.R</w:t>
-      </w:r>
-      <w:r>
-        <w:rPr>
-          <w:rFonts w:ascii="Helvetica" w:hAnsi="Helvetica"/>
-          <w:i/>
-          <w:iCs/>
-        </w:rPr>
-        <w:br/>
-        <w:t>populationTrends_functions.R</w:t>
+      <w:r>
+        <w:rPr>
+          <w:rFonts w:ascii="Helvetica" w:hAnsi="Helvetica"/>
+        </w:rPr>
+        <w:t>Placeholder for population-level</w:t>
+      </w:r>
+      <w:r>
+        <w:rPr>
+          <w:rFonts w:ascii="Helvetica" w:hAnsi="Helvetica"/>
+        </w:rPr>
+        <w:t xml:space="preserve"> trends</w:t>
       </w:r>
     </w:p>
     <w:p>
@@ -3341,13 +5325,7 @@
         <w:rPr>
           <w:rFonts w:ascii="Helvetica" w:hAnsi="Helvetica"/>
         </w:rPr>
-        <w:t>Placeholder for population-level</w:t>
-      </w:r>
-      <w:r>
-        <w:rPr>
-          <w:rFonts w:ascii="Helvetica" w:hAnsi="Helvetica"/>
-        </w:rPr>
-        <w:t xml:space="preserve"> trends</w:t>
+        <w:t>Has two tabs - first is temporal trends, second could be used for maps etc.</w:t>
       </w:r>
     </w:p>
     <w:p>
@@ -3365,7 +5343,7 @@
         <w:rPr>
           <w:rFonts w:ascii="Helvetica" w:hAnsi="Helvetica"/>
         </w:rPr>
-        <w:t>Has two tabs - first is temporal trends, second could be used for maps etc.</w:t>
+        <w:t>Can also add more tabs</w:t>
       </w:r>
     </w:p>
     <w:p>
@@ -3383,7 +5361,39 @@
         <w:rPr>
           <w:rFonts w:ascii="Helvetica" w:hAnsi="Helvetica"/>
         </w:rPr>
-        <w:t>Can also add more tabs</w:t>
+        <w:t>Have included two example temporal trend plots with filtering by species and trend type:</w:t>
+      </w:r>
+    </w:p>
+    <w:p>
+      <w:pPr>
+        <w:pStyle w:val="NormalWeb"/>
+        <w:numPr>
+          <w:ilvl w:val="1"/>
+          <w:numId w:val="1"/>
+        </w:numPr>
+        <w:rPr>
+          <w:rFonts w:ascii="Helvetica" w:hAnsi="Helvetica"/>
+        </w:rPr>
+      </w:pPr>
+      <w:r>
+        <w:rPr>
+          <w:rFonts w:ascii="Helvetica" w:hAnsi="Helvetica"/>
+        </w:rPr>
+        <w:t>Mean, earliest and latest lay dates per year</w:t>
+      </w:r>
+    </w:p>
+    <w:p>
+      <w:pPr>
+        <w:pStyle w:val="NormalWeb"/>
+        <w:rPr>
+          <w:rFonts w:ascii="Helvetica" w:hAnsi="Helvetica"/>
+        </w:rPr>
+      </w:pPr>
+      <w:r>
+        <w:rPr>
+          <w:rFonts w:ascii="Helvetica" w:hAnsi="Helvetica"/>
+        </w:rPr>
+        <w:t>Inputs:</w:t>
       </w:r>
     </w:p>
     <w:p>
@@ -3397,43 +5407,33 @@
           <w:rFonts w:ascii="Helvetica" w:hAnsi="Helvetica"/>
         </w:rPr>
       </w:pPr>
-      <w:r>
-        <w:rPr>
-          <w:rFonts w:ascii="Helvetica" w:hAnsi="Helvetica"/>
-        </w:rPr>
-        <w:t>Have included two example temporal trend plots with filtering by species and trend type:</w:t>
-      </w:r>
-    </w:p>
-    <w:p>
-      <w:pPr>
-        <w:pStyle w:val="NormalWeb"/>
-        <w:numPr>
-          <w:ilvl w:val="1"/>
-          <w:numId w:val="1"/>
-        </w:numPr>
-        <w:rPr>
-          <w:rFonts w:ascii="Helvetica" w:hAnsi="Helvetica"/>
-        </w:rPr>
-      </w:pPr>
-      <w:r>
-        <w:rPr>
-          <w:rFonts w:ascii="Helvetica" w:hAnsi="Helvetica"/>
-        </w:rPr>
-        <w:t>Mean, earliest and latest lay dates per year</w:t>
-      </w:r>
-    </w:p>
-    <w:p>
-      <w:pPr>
-        <w:pStyle w:val="NormalWeb"/>
-        <w:rPr>
-          <w:rFonts w:ascii="Helvetica" w:hAnsi="Helvetica"/>
-        </w:rPr>
-      </w:pPr>
-      <w:r>
-        <w:rPr>
-          <w:rFonts w:ascii="Helvetica" w:hAnsi="Helvetica"/>
-        </w:rPr>
-        <w:t>Inputs:</w:t>
+      <w:proofErr w:type="spellStart"/>
+      <w:r>
+        <w:rPr>
+          <w:rFonts w:ascii="Helvetica" w:hAnsi="Helvetica"/>
+        </w:rPr>
+        <w:t>IndData</w:t>
+      </w:r>
+      <w:proofErr w:type="spellEnd"/>
+      <w:r>
+        <w:rPr>
+          <w:rFonts w:ascii="Helvetica" w:hAnsi="Helvetica"/>
+        </w:rPr>
+        <w:t xml:space="preserve">: </w:t>
+      </w:r>
+      <w:proofErr w:type="spellStart"/>
+      <w:r>
+        <w:rPr>
+          <w:rFonts w:ascii="Helvetica" w:hAnsi="Helvetica"/>
+        </w:rPr>
+        <w:t>Dataframe</w:t>
+      </w:r>
+      <w:proofErr w:type="spellEnd"/>
+      <w:r>
+        <w:rPr>
+          <w:rFonts w:ascii="Helvetica" w:hAnsi="Helvetica"/>
+        </w:rPr>
+        <w:t xml:space="preserve"> containing individual-level information (optional, for future expansion)</w:t>
       </w:r>
     </w:p>
     <w:p>
@@ -3447,12 +5447,162 @@
           <w:rFonts w:ascii="Helvetica" w:hAnsi="Helvetica"/>
         </w:rPr>
       </w:pPr>
-      <w:r>
-        <w:rPr>
-          <w:rFonts w:ascii="Helvetica" w:hAnsi="Helvetica"/>
-        </w:rPr>
-        <w:t>IndData: Dataframe containing individual-level information (optional, for future expansion)</w:t>
-      </w:r>
+      <w:proofErr w:type="spellStart"/>
+      <w:r>
+        <w:rPr>
+          <w:rFonts w:ascii="Helvetica" w:hAnsi="Helvetica"/>
+        </w:rPr>
+        <w:t>BroodData</w:t>
+      </w:r>
+      <w:proofErr w:type="spellEnd"/>
+      <w:r>
+        <w:rPr>
+          <w:rFonts w:ascii="Helvetica" w:hAnsi="Helvetica"/>
+        </w:rPr>
+        <w:t xml:space="preserve">: </w:t>
+      </w:r>
+      <w:proofErr w:type="spellStart"/>
+      <w:r>
+        <w:rPr>
+          <w:rFonts w:ascii="Helvetica" w:hAnsi="Helvetica"/>
+        </w:rPr>
+        <w:t>Dataframe</w:t>
+      </w:r>
+      <w:proofErr w:type="spellEnd"/>
+      <w:r>
+        <w:rPr>
+          <w:rFonts w:ascii="Helvetica" w:hAnsi="Helvetica"/>
+        </w:rPr>
+        <w:t xml:space="preserve"> with brood-level information (</w:t>
+      </w:r>
+      <w:proofErr w:type="spellStart"/>
+      <w:r>
+        <w:rPr>
+          <w:rFonts w:ascii="Helvetica" w:hAnsi="Helvetica"/>
+        </w:rPr>
+        <w:t>BroodYear</w:t>
+      </w:r>
+      <w:proofErr w:type="spellEnd"/>
+      <w:r>
+        <w:rPr>
+          <w:rFonts w:ascii="Helvetica" w:hAnsi="Helvetica"/>
+        </w:rPr>
+        <w:t xml:space="preserve">, </w:t>
+      </w:r>
+      <w:proofErr w:type="spellStart"/>
+      <w:r>
+        <w:rPr>
+          <w:rFonts w:ascii="Helvetica" w:hAnsi="Helvetica"/>
+        </w:rPr>
+        <w:t>LayDate</w:t>
+      </w:r>
+      <w:proofErr w:type="spellEnd"/>
+      <w:r>
+        <w:rPr>
+          <w:rFonts w:ascii="Helvetica" w:hAnsi="Helvetica"/>
+        </w:rPr>
+        <w:t xml:space="preserve">, </w:t>
+      </w:r>
+      <w:proofErr w:type="spellStart"/>
+      <w:r>
+        <w:rPr>
+          <w:rFonts w:ascii="Helvetica" w:hAnsi="Helvetica"/>
+        </w:rPr>
+        <w:t>ClutchSize</w:t>
+      </w:r>
+      <w:proofErr w:type="spellEnd"/>
+      <w:r>
+        <w:rPr>
+          <w:rFonts w:ascii="Helvetica" w:hAnsi="Helvetica"/>
+        </w:rPr>
+        <w:t xml:space="preserve">, </w:t>
+      </w:r>
+      <w:proofErr w:type="spellStart"/>
+      <w:r>
+        <w:rPr>
+          <w:rFonts w:ascii="Helvetica" w:hAnsi="Helvetica"/>
+        </w:rPr>
+        <w:t>SpeciesName</w:t>
+      </w:r>
+      <w:proofErr w:type="spellEnd"/>
+      <w:r>
+        <w:rPr>
+          <w:rFonts w:ascii="Helvetica" w:hAnsi="Helvetica"/>
+        </w:rPr>
+        <w:t>, etc.)</w:t>
+      </w:r>
+    </w:p>
+    <w:p>
+      <w:pPr>
+        <w:pStyle w:val="NormalWeb"/>
+        <w:rPr>
+          <w:rFonts w:ascii="Helvetica" w:hAnsi="Helvetica"/>
+          <w:b/>
+          <w:bCs/>
+        </w:rPr>
+      </w:pPr>
+    </w:p>
+    <w:p>
+      <w:pPr>
+        <w:pStyle w:val="NormalWeb"/>
+        <w:rPr>
+          <w:rFonts w:ascii="Helvetica" w:hAnsi="Helvetica"/>
+          <w:b/>
+          <w:bCs/>
+        </w:rPr>
+      </w:pPr>
+      <w:r>
+        <w:rPr>
+          <w:rFonts w:ascii="Helvetica" w:hAnsi="Helvetica"/>
+          <w:b/>
+          <w:bCs/>
+        </w:rPr>
+        <w:t>Citizen science</w:t>
+      </w:r>
+      <w:r>
+        <w:rPr>
+          <w:rFonts w:ascii="Helvetica" w:hAnsi="Helvetica"/>
+          <w:b/>
+          <w:bCs/>
+        </w:rPr>
+        <w:t xml:space="preserve"> module</w:t>
+      </w:r>
+    </w:p>
+    <w:p>
+      <w:pPr>
+        <w:pStyle w:val="NormalWeb"/>
+        <w:rPr>
+          <w:rFonts w:ascii="Helvetica" w:hAnsi="Helvetica"/>
+          <w:i/>
+          <w:iCs/>
+        </w:rPr>
+      </w:pPr>
+      <w:proofErr w:type="spellStart"/>
+      <w:r>
+        <w:rPr>
+          <w:rFonts w:ascii="Helvetica" w:hAnsi="Helvetica"/>
+          <w:i/>
+          <w:iCs/>
+        </w:rPr>
+        <w:t>citizenScience_module</w:t>
+      </w:r>
+      <w:r>
+        <w:rPr>
+          <w:rFonts w:ascii="Helvetica" w:hAnsi="Helvetica"/>
+          <w:i/>
+          <w:iCs/>
+        </w:rPr>
+        <w:t>.</w:t>
+      </w:r>
+      <w:r>
+        <w:rPr>
+          <w:rFonts w:ascii="Helvetica" w:hAnsi="Helvetica"/>
+          <w:i/>
+          <w:iCs/>
+        </w:rPr>
+        <w:t>R</w:t>
+      </w:r>
+      <w:proofErr w:type="spellEnd"/>
     </w:p>
     <w:p>
       <w:pPr>
@@ -3469,77 +5619,13 @@
         <w:rPr>
           <w:rFonts w:ascii="Helvetica" w:hAnsi="Helvetica"/>
         </w:rPr>
-        <w:t>BroodData: Dataframe with brood-level information (BroodYear, LayDate, ClutchSize, SpeciesName, etc.)</w:t>
-      </w:r>
-    </w:p>
-    <w:p>
-      <w:pPr>
-        <w:pStyle w:val="NormalWeb"/>
-        <w:rPr>
-          <w:rFonts w:ascii="Helvetica" w:hAnsi="Helvetica"/>
-          <w:b/>
-          <w:bCs/>
-        </w:rPr>
-      </w:pPr>
-    </w:p>
-    <w:p>
-      <w:pPr>
-        <w:pStyle w:val="NormalWeb"/>
-        <w:rPr>
-          <w:rFonts w:ascii="Helvetica" w:hAnsi="Helvetica"/>
-          <w:b/>
-          <w:bCs/>
-        </w:rPr>
-      </w:pPr>
-      <w:r>
-        <w:rPr>
-          <w:rFonts w:ascii="Helvetica" w:hAnsi="Helvetica"/>
-          <w:b/>
-          <w:bCs/>
-        </w:rPr>
-        <w:t>Citizen science</w:t>
-      </w:r>
-      <w:r>
-        <w:rPr>
-          <w:rFonts w:ascii="Helvetica" w:hAnsi="Helvetica"/>
-          <w:b/>
-          <w:bCs/>
-        </w:rPr>
-        <w:t xml:space="preserve"> module</w:t>
-      </w:r>
-    </w:p>
-    <w:p>
-      <w:pPr>
-        <w:pStyle w:val="NormalWeb"/>
-        <w:rPr>
-          <w:rFonts w:ascii="Helvetica" w:hAnsi="Helvetica"/>
-          <w:i/>
-          <w:iCs/>
-        </w:rPr>
-      </w:pPr>
-      <w:r>
-        <w:rPr>
-          <w:rFonts w:ascii="Helvetica" w:hAnsi="Helvetica"/>
-          <w:i/>
-          <w:iCs/>
-        </w:rPr>
-        <w:t>citizenScience_module</w:t>
-      </w:r>
-      <w:r>
-        <w:rPr>
-          <w:rFonts w:ascii="Helvetica" w:hAnsi="Helvetica"/>
-          <w:i/>
-          <w:iCs/>
-        </w:rPr>
-        <w:t>.</w:t>
-      </w:r>
-      <w:r>
-        <w:rPr>
-          <w:rFonts w:ascii="Helvetica" w:hAnsi="Helvetica"/>
-          <w:i/>
-          <w:iCs/>
-        </w:rPr>
-        <w:t>R</w:t>
+        <w:t xml:space="preserve">Placeholder for </w:t>
+      </w:r>
+      <w:r>
+        <w:rPr>
+          <w:rFonts w:ascii="Helvetica" w:hAnsi="Helvetica"/>
+        </w:rPr>
+        <w:t>citizen science module</w:t>
       </w:r>
     </w:p>
     <w:p>
@@ -3557,14 +5643,64 @@
         <w:rPr>
           <w:rFonts w:ascii="Helvetica" w:hAnsi="Helvetica"/>
         </w:rPr>
-        <w:t xml:space="preserve">Placeholder for </w:t>
-      </w:r>
-      <w:r>
-        <w:rPr>
-          <w:rFonts w:ascii="Helvetica" w:hAnsi="Helvetica"/>
-        </w:rPr>
-        <w:t>citizen science module</w:t>
-      </w:r>
+        <w:t>E</w:t>
+      </w:r>
+      <w:r>
+        <w:rPr>
+          <w:rFonts w:ascii="Helvetica" w:hAnsi="Helvetica"/>
+        </w:rPr>
+        <w:t>mpty</w:t>
+      </w:r>
+      <w:r>
+        <w:rPr>
+          <w:rFonts w:ascii="Helvetica" w:hAnsi="Helvetica"/>
+        </w:rPr>
+        <w:t xml:space="preserve"> – just for formatting</w:t>
+      </w:r>
+    </w:p>
+    <w:p>
+      <w:pPr>
+        <w:pStyle w:val="NormalWeb"/>
+        <w:rPr>
+          <w:rFonts w:ascii="Helvetica" w:hAnsi="Helvetica"/>
+        </w:rPr>
+      </w:pPr>
+    </w:p>
+    <w:p>
+      <w:pPr>
+        <w:pStyle w:val="NormalWeb"/>
+        <w:rPr>
+          <w:rFonts w:ascii="Helvetica" w:hAnsi="Helvetica"/>
+          <w:b/>
+          <w:bCs/>
+        </w:rPr>
+      </w:pPr>
+      <w:r>
+        <w:rPr>
+          <w:rFonts w:ascii="Helvetica" w:hAnsi="Helvetica"/>
+          <w:b/>
+          <w:bCs/>
+        </w:rPr>
+        <w:t>Helpers/</w:t>
+      </w:r>
+      <w:proofErr w:type="spellStart"/>
+      <w:r>
+        <w:rPr>
+          <w:rFonts w:ascii="Helvetica" w:hAnsi="Helvetica"/>
+          <w:b/>
+          <w:bCs/>
+        </w:rPr>
+        <w:t>creating_coloured</w:t>
+      </w:r>
+      <w:r>
+        <w:rPr>
+          <w:rFonts w:ascii="Helvetica" w:hAnsi="Helvetica"/>
+          <w:b/>
+          <w:bCs/>
+        </w:rPr>
+        <w:t>_icons.R</w:t>
+      </w:r>
+      <w:proofErr w:type="spellEnd"/>
     </w:p>
     <w:p>
       <w:pPr>
@@ -3575,40 +5711,6 @@
         </w:numPr>
         <w:rPr>
           <w:rFonts w:ascii="Helvetica" w:hAnsi="Helvetica"/>
-        </w:rPr>
-      </w:pPr>
-      <w:r>
-        <w:rPr>
-          <w:rFonts w:ascii="Helvetica" w:hAnsi="Helvetica"/>
-        </w:rPr>
-        <w:t>E</w:t>
-      </w:r>
-      <w:r>
-        <w:rPr>
-          <w:rFonts w:ascii="Helvetica" w:hAnsi="Helvetica"/>
-        </w:rPr>
-        <w:t>mpty</w:t>
-      </w:r>
-      <w:r>
-        <w:rPr>
-          <w:rFonts w:ascii="Helvetica" w:hAnsi="Helvetica"/>
-        </w:rPr>
-        <w:t xml:space="preserve"> – just for formatting</w:t>
-      </w:r>
-    </w:p>
-    <w:p>
-      <w:pPr>
-        <w:pStyle w:val="NormalWeb"/>
-        <w:rPr>
-          <w:rFonts w:ascii="Helvetica" w:hAnsi="Helvetica"/>
-        </w:rPr>
-      </w:pPr>
-    </w:p>
-    <w:p>
-      <w:pPr>
-        <w:pStyle w:val="NormalWeb"/>
-        <w:rPr>
-          <w:rFonts w:ascii="Helvetica" w:hAnsi="Helvetica"/>
           <w:b/>
           <w:bCs/>
         </w:rPr>
@@ -3616,66 +5718,42 @@
       <w:r>
         <w:rPr>
           <w:rFonts w:ascii="Helvetica" w:hAnsi="Helvetica"/>
+        </w:rPr>
+        <w:t xml:space="preserve">Script for generating colour ring icons to use in </w:t>
+      </w:r>
+      <w:proofErr w:type="spellStart"/>
+      <w:r>
+        <w:rPr>
+          <w:rFonts w:ascii="Helvetica" w:hAnsi="Helvetica"/>
+        </w:rPr>
+        <w:t>BirdFinder</w:t>
+      </w:r>
+      <w:proofErr w:type="spellEnd"/>
+      <w:r>
+        <w:rPr>
+          <w:rFonts w:ascii="Helvetica" w:hAnsi="Helvetica"/>
+        </w:rPr>
+        <w:t xml:space="preserve"> dropdowns</w:t>
+      </w:r>
+    </w:p>
+    <w:p>
+      <w:pPr>
+        <w:pStyle w:val="NormalWeb"/>
+        <w:rPr>
+          <w:rFonts w:ascii="Helvetica" w:hAnsi="Helvetica"/>
           <w:b/>
           <w:bCs/>
         </w:rPr>
-        <w:t>Helpers/</w:t>
-      </w:r>
-      <w:r>
+      </w:pPr>
+    </w:p>
+    <w:p>
+      <w:pPr>
+        <w:pStyle w:val="NormalWeb"/>
         <w:rPr>
           <w:rFonts w:ascii="Helvetica" w:hAnsi="Helvetica"/>
           <w:b/>
           <w:bCs/>
         </w:rPr>
-        <w:t>creating_coloured</w:t>
-      </w:r>
-      <w:r>
-        <w:rPr>
-          <w:rFonts w:ascii="Helvetica" w:hAnsi="Helvetica"/>
-          <w:b/>
-          <w:bCs/>
-        </w:rPr>
-        <w:t>_icons.R</w:t>
-      </w:r>
-    </w:p>
-    <w:p>
-      <w:pPr>
-        <w:pStyle w:val="NormalWeb"/>
-        <w:numPr>
-          <w:ilvl w:val="0"/>
-          <w:numId w:val="1"/>
-        </w:numPr>
-        <w:rPr>
-          <w:rFonts w:ascii="Helvetica" w:hAnsi="Helvetica"/>
-          <w:b/>
-          <w:bCs/>
-        </w:rPr>
-      </w:pPr>
-      <w:r>
-        <w:rPr>
-          <w:rFonts w:ascii="Helvetica" w:hAnsi="Helvetica"/>
-        </w:rPr>
-        <w:t>Script for generating colour ring icons to use in BirdFinder dropdowns</w:t>
-      </w:r>
-    </w:p>
-    <w:p>
-      <w:pPr>
-        <w:pStyle w:val="NormalWeb"/>
-        <w:rPr>
-          <w:rFonts w:ascii="Helvetica" w:hAnsi="Helvetica"/>
-          <w:b/>
-          <w:bCs/>
-        </w:rPr>
-      </w:pPr>
-    </w:p>
-    <w:p>
-      <w:pPr>
-        <w:pStyle w:val="NormalWeb"/>
-        <w:rPr>
-          <w:rFonts w:ascii="Helvetica" w:hAnsi="Helvetica"/>
-          <w:b/>
-          <w:bCs/>
-        </w:rPr>
       </w:pPr>
     </w:p>
     <w:p>
@@ -3688,6 +5766,7 @@
           <w:szCs w:val="40"/>
         </w:rPr>
       </w:pPr>
+      <w:proofErr w:type="spellStart"/>
       <w:r>
         <w:rPr>
           <w:rStyle w:val="Strong"/>
@@ -3695,7 +5774,17 @@
           <w:sz w:val="40"/>
           <w:szCs w:val="40"/>
         </w:rPr>
-        <w:t>Mini_mapping_app/</w:t>
+        <w:t>Mini_mapping_app</w:t>
+      </w:r>
+      <w:proofErr w:type="spellEnd"/>
+      <w:r>
+        <w:rPr>
+          <w:rStyle w:val="Strong"/>
+          <w:rFonts w:ascii="Helvetica" w:eastAsiaTheme="majorEastAsia" w:hAnsi="Helvetica"/>
+          <w:sz w:val="40"/>
+          <w:szCs w:val="40"/>
+        </w:rPr>
+        <w:t>/</w:t>
       </w:r>
     </w:p>
     <w:p>
@@ -3773,7 +5862,7 @@
 </file>
 
 <file path=word/numbering.xml><?xml version="1.0" encoding="utf-8"?>
-<w:numbering xmlns:wpc="http://schemas.microsoft.com/office/word/2010/wordprocessingCanvas" xmlns:cx="http://schemas.microsoft.com/office/drawing/2014/chartex" xmlns:cx1="http://schemas.microsoft.com/office/drawing/2015/9/8/chartex" xmlns:cx2="http://schemas.microsoft.com/office/drawing/2015/10/21/chartex" xmlns:cx3="http://schemas.microsoft.com/office/drawing/2016/5/9/chartex" xmlns:cx4="http://schemas.microsoft.com/office/drawing/2016/5/10/chartex" xmlns:cx5="http://schemas.microsoft.com/office/drawing/2016/5/11/chartex" xmlns:cx6="http://schemas.microsoft.com/office/drawing/2016/5/12/chartex" xmlns:cx7="http://schemas.microsoft.com/office/drawing/2016/5/13/chartex" xmlns:cx8="http://schemas.microsoft.com/office/drawing/2016/5/14/chartex" xmlns:mc="http://schemas.openxmlformats.org/markup-compatibility/2006" xmlns:aink="http://schemas.microsoft.com/office/drawing/2016/ink" xmlns:am3d="http://schemas.microsoft.com/office/drawing/2017/model3d" xmlns:o="urn:schemas-microsoft-com:office:office" xmlns:oel="http://schemas.microsoft.com/office/2019/extlst" xmlns:r="http://schemas.openxmlformats.org/officeDocument/2006/relationships" xmlns:m="http://schemas.openxmlformats.org/officeDocument/2006/math" xmlns:v="urn:schemas-microsoft-com:vml" xmlns:wp14="http://schemas.microsoft.com/office/word/2010/wordprocessingDrawing" xmlns:wp="http://schemas.openxmlformats.org/drawingml/2006/wordprocessingDrawing" xmlns:w10="urn:schemas-microsoft-com:office:word" xmlns:w="http://schemas.openxmlformats.org/wordprocessingml/2006/main" xmlns:w14="http://schemas.microsoft.com/office/word/2010/wordml" xmlns:w15="http://schemas.microsoft.com/office/word/2012/wordml" xmlns:w16cex="http://schemas.microsoft.com/office/word/2018/wordml/cex" xmlns:w16cid="http://schemas.microsoft.com/office/word/2016/wordml/cid" xmlns:w16="http://schemas.microsoft.com/office/word/2018/wordml" xmlns:w16du="http://schemas.microsoft.com/office/word/2023/wordml/word16du" xmlns:w16sdtdh="http://schemas.microsoft.com/office/word/2020/wordml/sdtdatahash" xmlns:w16sdtfl="http://schemas.microsoft.com/office/word/2024/wordml/sdtformatlock" xmlns:w16se="http://schemas.microsoft.com/office/word/2015/wordml/symex" xmlns:wpg="http://schemas.microsoft.com/office/word/2010/wordprocessingGroup" xmlns:wpi="http://schemas.microsoft.com/office/word/2010/wordprocessingInk" xmlns:wne="http://schemas.microsoft.com/office/word/2006/wordml" xmlns:wps="http://schemas.microsoft.com/office/word/2010/wordprocessingShape" mc:Ignorable="w14 w15 w16se w16cid w16 w16cex w16sdtdh w16sdtfl w16du wp14">
+<w:numbering xmlns:wpc="http://schemas.microsoft.com/office/word/2010/wordprocessingCanvas" xmlns:cx="http://schemas.microsoft.com/office/drawing/2014/chartex" xmlns:cx1="http://schemas.microsoft.com/office/drawing/2015/9/8/chartex" xmlns:cx2="http://schemas.microsoft.com/office/drawing/2015/10/21/chartex" xmlns:cx3="http://schemas.microsoft.com/office/drawing/2016/5/9/chartex" xmlns:cx4="http://schemas.microsoft.com/office/drawing/2016/5/10/chartex" xmlns:cx5="http://schemas.microsoft.com/office/drawing/2016/5/11/chartex" xmlns:cx6="http://schemas.microsoft.com/office/drawing/2016/5/12/chartex" xmlns:cx7="http://schemas.microsoft.com/office/drawing/2016/5/13/chartex" xmlns:cx8="http://schemas.microsoft.com/office/drawing/2016/5/14/chartex" xmlns:mc="http://schemas.openxmlformats.org/markup-compatibility/2006" xmlns:m="http://schemas.openxmlformats.org/officeDocument/2006/math" xmlns:aink="http://schemas.microsoft.com/office/drawing/2016/ink" xmlns:am3d="http://schemas.microsoft.com/office/drawing/2017/model3d" xmlns:oel="http://schemas.microsoft.com/office/2019/extlst" xmlns:r="http://schemas.openxmlformats.org/officeDocument/2006/relationships" xmlns:wp14="http://schemas.microsoft.com/office/word/2010/wordprocessingDrawing" xmlns:wp="http://schemas.openxmlformats.org/drawingml/2006/wordprocessingDrawing" xmlns:wpg="http://schemas.microsoft.com/office/word/2010/wordprocessingGroup" xmlns:wpi="http://schemas.microsoft.com/office/word/2010/wordprocessingInk" xmlns:wps="http://schemas.microsoft.com/office/word/2010/wordprocessingShape" xmlns:o="urn:schemas-microsoft-com:office:office" xmlns:v="urn:schemas-microsoft-com:vml" xmlns:w10="urn:schemas-microsoft-com:office:word" xmlns:w="http://schemas.openxmlformats.org/wordprocessingml/2006/main" xmlns:w14="http://schemas.microsoft.com/office/word/2010/wordml" xmlns:w15="http://schemas.microsoft.com/office/word/2012/wordml" xmlns:w16cei="http://schemas.microsoft.com/office/word/2026/wordml/cei" xmlns:w16cex="http://schemas.microsoft.com/office/word/2018/wordml/cex" xmlns:w16cid="http://schemas.microsoft.com/office/word/2016/wordml/cid" xmlns:w16="http://schemas.microsoft.com/office/word/2018/wordml" xmlns:w16sdtdh="http://schemas.microsoft.com/office/word/2020/wordml/sdtdatahash" xmlns:w16sdtfl="http://schemas.microsoft.com/office/word/2024/wordml/sdtformatlock" xmlns:w16se="http://schemas.microsoft.com/office/word/2015/wordml/symex" xmlns:w16du="http://schemas.microsoft.com/office/word/2023/wordml/word16du" xmlns:wne="http://schemas.microsoft.com/office/word/2006/wordml" mc:Ignorable="w14 w15 w16se w16cid w16 w16cex w16sdtdh w16sdtfl w16du wp14">
   <w:abstractNum w:abstractNumId="0" w15:restartNumberingAfterBreak="0">
     <w:nsid w:val="00E02FAD"/>
     <w:multiLevelType w:val="hybridMultilevel"/>
@@ -5534,7 +7623,7 @@
 </file>
 
 <file path=word/styles.xml><?xml version="1.0" encoding="utf-8"?>
-<w:styles xmlns:mc="http://schemas.openxmlformats.org/markup-compatibility/2006" xmlns:r="http://schemas.openxmlformats.org/officeDocument/2006/relationships" xmlns:w="http://schemas.openxmlformats.org/wordprocessingml/2006/main" xmlns:w14="http://schemas.microsoft.com/office/word/2010/wordml" xmlns:w15="http://schemas.microsoft.com/office/word/2012/wordml" xmlns:w16cex="http://schemas.microsoft.com/office/word/2018/wordml/cex" xmlns:w16cid="http://schemas.microsoft.com/office/word/2016/wordml/cid" xmlns:w16="http://schemas.microsoft.com/office/word/2018/wordml" xmlns:w16du="http://schemas.microsoft.com/office/word/2023/wordml/word16du" xmlns:w16sdtdh="http://schemas.microsoft.com/office/word/2020/wordml/sdtdatahash" xmlns:w16sdtfl="http://schemas.microsoft.com/office/word/2024/wordml/sdtformatlock" xmlns:w16se="http://schemas.microsoft.com/office/word/2015/wordml/symex" mc:Ignorable="w14 w15 w16se w16cid w16 w16cex w16sdtdh w16sdtfl w16du">
+<w:styles xmlns:mc="http://schemas.openxmlformats.org/markup-compatibility/2006" xmlns:r="http://schemas.openxmlformats.org/officeDocument/2006/relationships" xmlns:w="http://schemas.openxmlformats.org/wordprocessingml/2006/main" xmlns:w14="http://schemas.microsoft.com/office/word/2010/wordml" xmlns:w15="http://schemas.microsoft.com/office/word/2012/wordml" xmlns:w16cex="http://schemas.microsoft.com/office/word/2018/wordml/cex" xmlns:w16cid="http://schemas.microsoft.com/office/word/2016/wordml/cid" xmlns:w16="http://schemas.microsoft.com/office/word/2018/wordml" xmlns:w16sdtdh="http://schemas.microsoft.com/office/word/2020/wordml/sdtdatahash" xmlns:w16sdtfl="http://schemas.microsoft.com/office/word/2024/wordml/sdtformatlock" xmlns:w16se="http://schemas.microsoft.com/office/word/2015/wordml/symex" xmlns:w16du="http://schemas.microsoft.com/office/word/2023/wordml/word16du" mc:Ignorable="w14 w15 w16se w16cid w16 w16cex w16sdtdh w16sdtfl w16du">
   <w:docDefaults>
     <w:rPrDefault>
       <w:rPr>

</xml_diff>